<commit_message>
docs(school): add Sprint & PB (backlog) IDs to WS5 test artifacts
Make the four IDs cross-reference the real backlog: test case ID, PB
(product backlog task), Sprint ID, and RQ (user story) now match the
"ws4.1 sprints" sheet of 2607lts nhóm 1 WebBshoes.xlsx exactly.

- TestCase.xlsx: each module sheet header shows Sprint + PB; Test Case
  List becomes a Sprint -> PB -> RQ -> Test case traceability matrix.
- DefectReport.xlsx: group headers show module PB / Sprint / RQ.
- WORKSHOP_5_BShoes.docx: scope and traceability tables gain Sprint + PB
  columns.

Mapping: DN=pb-1/S1, NV=pb-2/S1, SP+DMTT=pb-3/S1, KHO=PB-4/S1,
POS+GH=PB-5/S2, PGG=PB-6/S2, TH=PB-7/S3, KH=PB-8/S3.

Co-Authored-By: Claude Opus 4.8 (1M context) <noreply@anthropic.com>
</commit_message>
<xml_diff>
--- a/doc-school/ws5/WORKSHOP_5_BShoes.docx
+++ b/doc-school/ws5/WORKSHOP_5_BShoes.docx
@@ -4165,10 +4165,12 @@
         </w:tblBorders>
       </w:tblPr>
       <w:tblGrid>
-        <w:gridCol w:w="8"/>
-        <w:gridCol w:w="34"/>
-        <w:gridCol w:w="42"/>
-        <w:gridCol w:w="16"/>
+        <w:gridCol w:w="6"/>
+        <w:gridCol w:w="12"/>
+        <w:gridCol w:w="10"/>
+        <w:gridCol w:w="30"/>
+        <w:gridCol w:w="30"/>
+        <w:gridCol w:w="12"/>
       </w:tblGrid>
       <w:tr>
         <w:trPr>
@@ -4238,7 +4240,7 @@
                 <w:sz w:val="20"/>
                 <w:szCs w:val="20"/>
               </w:rPr>
-              <w:t xml:space="preserve">Module</w:t>
+              <w:t xml:space="preserve">Sprint</w:t>
             </w:r>
           </w:p>
         </w:tc>
@@ -4272,7 +4274,7 @@
                 <w:sz w:val="20"/>
                 <w:szCs w:val="20"/>
               </w:rPr>
-              <w:t xml:space="preserve">Yêu cầu (RQ)</w:t>
+              <w:t xml:space="preserve">PB</w:t>
             </w:r>
           </w:p>
         </w:tc>
@@ -4306,7 +4308,75 @@
                 <w:sz w:val="20"/>
                 <w:szCs w:val="20"/>
               </w:rPr>
-              <w:t xml:space="preserve">Số test case</w:t>
+              <w:t xml:space="preserve">Module</w:t>
+            </w:r>
+          </w:p>
+        </w:tc>
+        <w:tc>
+          <w:tcPr>
+            <w:tcBorders>
+              <w:top w:val="single" w:color="BFBFBF" w:sz="4"/>
+              <w:left w:val="single" w:color="BFBFBF" w:sz="4"/>
+              <w:bottom w:val="single" w:color="BFBFBF" w:sz="4"/>
+              <w:right w:val="single" w:color="BFBFBF" w:sz="4"/>
+            </w:tcBorders>
+            <w:shd w:fill="1F3864" w:color="auto" w:val="clear"/>
+            <w:tcMar>
+              <w:top w:type="dxa" w:w="40"/>
+              <w:left w:type="dxa" w:w="80"/>
+              <w:bottom w:type="dxa" w:w="40"/>
+              <w:right w:type="dxa" w:w="80"/>
+            </w:tcMar>
+          </w:tcPr>
+          <w:p>
+            <w:pPr>
+              <w:spacing w:after="0" w:line="250"/>
+              <w:jc w:val="center"/>
+            </w:pPr>
+            <w:r>
+              <w:rPr>
+                <w:rFonts w:ascii="Times New Roman" w:cs="Times New Roman" w:eastAsia="Times New Roman" w:hAnsi="Times New Roman"/>
+                <w:b/>
+                <w:bCs/>
+                <w:color w:val="FFFFFF"/>
+                <w:sz w:val="20"/>
+                <w:szCs w:val="20"/>
+              </w:rPr>
+              <w:t xml:space="preserve">Yêu cầu (RQ)</w:t>
+            </w:r>
+          </w:p>
+        </w:tc>
+        <w:tc>
+          <w:tcPr>
+            <w:tcBorders>
+              <w:top w:val="single" w:color="BFBFBF" w:sz="4"/>
+              <w:left w:val="single" w:color="BFBFBF" w:sz="4"/>
+              <w:bottom w:val="single" w:color="BFBFBF" w:sz="4"/>
+              <w:right w:val="single" w:color="BFBFBF" w:sz="4"/>
+            </w:tcBorders>
+            <w:shd w:fill="1F3864" w:color="auto" w:val="clear"/>
+            <w:tcMar>
+              <w:top w:type="dxa" w:w="40"/>
+              <w:left w:type="dxa" w:w="80"/>
+              <w:bottom w:type="dxa" w:w="40"/>
+              <w:right w:type="dxa" w:w="80"/>
+            </w:tcMar>
+          </w:tcPr>
+          <w:p>
+            <w:pPr>
+              <w:spacing w:after="0" w:line="250"/>
+              <w:jc w:val="center"/>
+            </w:pPr>
+            <w:r>
+              <w:rPr>
+                <w:rFonts w:ascii="Times New Roman" w:cs="Times New Roman" w:eastAsia="Times New Roman" w:hAnsi="Times New Roman"/>
+                <w:b/>
+                <w:bCs/>
+                <w:color w:val="FFFFFF"/>
+                <w:sz w:val="20"/>
+                <w:szCs w:val="20"/>
+              </w:rPr>
+              <w:t xml:space="preserve">Số TC</w:t>
             </w:r>
           </w:p>
         </w:tc>
@@ -4330,7 +4400,7 @@
           <w:p>
             <w:pPr>
               <w:spacing w:after="0" w:line="250"/>
-              <w:jc w:val="left"/>
+              <w:jc w:val="center"/>
             </w:pPr>
             <w:r>
               <w:rPr>
@@ -4339,6 +4409,66 @@
                 <w:szCs w:val="20"/>
               </w:rPr>
               <w:t xml:space="preserve">1</w:t>
+            </w:r>
+          </w:p>
+        </w:tc>
+        <w:tc>
+          <w:tcPr>
+            <w:tcBorders>
+              <w:top w:val="single" w:color="BFBFBF" w:sz="4"/>
+              <w:left w:val="single" w:color="BFBFBF" w:sz="4"/>
+              <w:bottom w:val="single" w:color="BFBFBF" w:sz="4"/>
+              <w:right w:val="single" w:color="BFBFBF" w:sz="4"/>
+            </w:tcBorders>
+            <w:tcMar>
+              <w:top w:type="dxa" w:w="40"/>
+              <w:left w:type="dxa" w:w="80"/>
+              <w:bottom w:type="dxa" w:w="40"/>
+              <w:right w:type="dxa" w:w="80"/>
+            </w:tcMar>
+          </w:tcPr>
+          <w:p>
+            <w:pPr>
+              <w:spacing w:after="0" w:line="250"/>
+              <w:jc w:val="center"/>
+            </w:pPr>
+            <w:r>
+              <w:rPr>
+                <w:rFonts w:ascii="Times New Roman" w:cs="Times New Roman" w:eastAsia="Times New Roman" w:hAnsi="Times New Roman"/>
+                <w:sz w:val="20"/>
+                <w:szCs w:val="20"/>
+              </w:rPr>
+              <w:t xml:space="preserve">Sprint 1</w:t>
+            </w:r>
+          </w:p>
+        </w:tc>
+        <w:tc>
+          <w:tcPr>
+            <w:tcBorders>
+              <w:top w:val="single" w:color="BFBFBF" w:sz="4"/>
+              <w:left w:val="single" w:color="BFBFBF" w:sz="4"/>
+              <w:bottom w:val="single" w:color="BFBFBF" w:sz="4"/>
+              <w:right w:val="single" w:color="BFBFBF" w:sz="4"/>
+            </w:tcBorders>
+            <w:tcMar>
+              <w:top w:type="dxa" w:w="40"/>
+              <w:left w:type="dxa" w:w="80"/>
+              <w:bottom w:type="dxa" w:w="40"/>
+              <w:right w:type="dxa" w:w="80"/>
+            </w:tcMar>
+          </w:tcPr>
+          <w:p>
+            <w:pPr>
+              <w:spacing w:after="0" w:line="250"/>
+              <w:jc w:val="center"/>
+            </w:pPr>
+            <w:r>
+              <w:rPr>
+                <w:rFonts w:ascii="Times New Roman" w:cs="Times New Roman" w:eastAsia="Times New Roman" w:hAnsi="Times New Roman"/>
+                <w:sz w:val="20"/>
+                <w:szCs w:val="20"/>
+              </w:rPr>
+              <w:t xml:space="preserve">pb-1</w:t>
             </w:r>
           </w:p>
         </w:tc>
@@ -4453,7 +4583,7 @@
           <w:p>
             <w:pPr>
               <w:spacing w:after="0" w:line="250"/>
-              <w:jc w:val="left"/>
+              <w:jc w:val="center"/>
             </w:pPr>
             <w:r>
               <w:rPr>
@@ -4462,6 +4592,68 @@
                 <w:szCs w:val="20"/>
               </w:rPr>
               <w:t xml:space="preserve">2</w:t>
+            </w:r>
+          </w:p>
+        </w:tc>
+        <w:tc>
+          <w:tcPr>
+            <w:tcBorders>
+              <w:top w:val="single" w:color="BFBFBF" w:sz="4"/>
+              <w:left w:val="single" w:color="BFBFBF" w:sz="4"/>
+              <w:bottom w:val="single" w:color="BFBFBF" w:sz="4"/>
+              <w:right w:val="single" w:color="BFBFBF" w:sz="4"/>
+            </w:tcBorders>
+            <w:shd w:fill="F2F2F2" w:color="auto" w:val="clear"/>
+            <w:tcMar>
+              <w:top w:type="dxa" w:w="40"/>
+              <w:left w:type="dxa" w:w="80"/>
+              <w:bottom w:type="dxa" w:w="40"/>
+              <w:right w:type="dxa" w:w="80"/>
+            </w:tcMar>
+          </w:tcPr>
+          <w:p>
+            <w:pPr>
+              <w:spacing w:after="0" w:line="250"/>
+              <w:jc w:val="center"/>
+            </w:pPr>
+            <w:r>
+              <w:rPr>
+                <w:rFonts w:ascii="Times New Roman" w:cs="Times New Roman" w:eastAsia="Times New Roman" w:hAnsi="Times New Roman"/>
+                <w:sz w:val="20"/>
+                <w:szCs w:val="20"/>
+              </w:rPr>
+              <w:t xml:space="preserve">Sprint 1</w:t>
+            </w:r>
+          </w:p>
+        </w:tc>
+        <w:tc>
+          <w:tcPr>
+            <w:tcBorders>
+              <w:top w:val="single" w:color="BFBFBF" w:sz="4"/>
+              <w:left w:val="single" w:color="BFBFBF" w:sz="4"/>
+              <w:bottom w:val="single" w:color="BFBFBF" w:sz="4"/>
+              <w:right w:val="single" w:color="BFBFBF" w:sz="4"/>
+            </w:tcBorders>
+            <w:shd w:fill="F2F2F2" w:color="auto" w:val="clear"/>
+            <w:tcMar>
+              <w:top w:type="dxa" w:w="40"/>
+              <w:left w:type="dxa" w:w="80"/>
+              <w:bottom w:type="dxa" w:w="40"/>
+              <w:right w:type="dxa" w:w="80"/>
+            </w:tcMar>
+          </w:tcPr>
+          <w:p>
+            <w:pPr>
+              <w:spacing w:after="0" w:line="250"/>
+              <w:jc w:val="center"/>
+            </w:pPr>
+            <w:r>
+              <w:rPr>
+                <w:rFonts w:ascii="Times New Roman" w:cs="Times New Roman" w:eastAsia="Times New Roman" w:hAnsi="Times New Roman"/>
+                <w:sz w:val="20"/>
+                <w:szCs w:val="20"/>
+              </w:rPr>
+              <w:t xml:space="preserve">pb-2</w:t>
             </w:r>
           </w:p>
         </w:tc>
@@ -4578,7 +4770,7 @@
           <w:p>
             <w:pPr>
               <w:spacing w:after="0" w:line="250"/>
-              <w:jc w:val="left"/>
+              <w:jc w:val="center"/>
             </w:pPr>
             <w:r>
               <w:rPr>
@@ -4587,6 +4779,66 @@
                 <w:szCs w:val="20"/>
               </w:rPr>
               <w:t xml:space="preserve">3</w:t>
+            </w:r>
+          </w:p>
+        </w:tc>
+        <w:tc>
+          <w:tcPr>
+            <w:tcBorders>
+              <w:top w:val="single" w:color="BFBFBF" w:sz="4"/>
+              <w:left w:val="single" w:color="BFBFBF" w:sz="4"/>
+              <w:bottom w:val="single" w:color="BFBFBF" w:sz="4"/>
+              <w:right w:val="single" w:color="BFBFBF" w:sz="4"/>
+            </w:tcBorders>
+            <w:tcMar>
+              <w:top w:type="dxa" w:w="40"/>
+              <w:left w:type="dxa" w:w="80"/>
+              <w:bottom w:type="dxa" w:w="40"/>
+              <w:right w:type="dxa" w:w="80"/>
+            </w:tcMar>
+          </w:tcPr>
+          <w:p>
+            <w:pPr>
+              <w:spacing w:after="0" w:line="250"/>
+              <w:jc w:val="center"/>
+            </w:pPr>
+            <w:r>
+              <w:rPr>
+                <w:rFonts w:ascii="Times New Roman" w:cs="Times New Roman" w:eastAsia="Times New Roman" w:hAnsi="Times New Roman"/>
+                <w:sz w:val="20"/>
+                <w:szCs w:val="20"/>
+              </w:rPr>
+              <w:t xml:space="preserve">Sprint 1</w:t>
+            </w:r>
+          </w:p>
+        </w:tc>
+        <w:tc>
+          <w:tcPr>
+            <w:tcBorders>
+              <w:top w:val="single" w:color="BFBFBF" w:sz="4"/>
+              <w:left w:val="single" w:color="BFBFBF" w:sz="4"/>
+              <w:bottom w:val="single" w:color="BFBFBF" w:sz="4"/>
+              <w:right w:val="single" w:color="BFBFBF" w:sz="4"/>
+            </w:tcBorders>
+            <w:tcMar>
+              <w:top w:type="dxa" w:w="40"/>
+              <w:left w:type="dxa" w:w="80"/>
+              <w:bottom w:type="dxa" w:w="40"/>
+              <w:right w:type="dxa" w:w="80"/>
+            </w:tcMar>
+          </w:tcPr>
+          <w:p>
+            <w:pPr>
+              <w:spacing w:after="0" w:line="250"/>
+              <w:jc w:val="center"/>
+            </w:pPr>
+            <w:r>
+              <w:rPr>
+                <w:rFonts w:ascii="Times New Roman" w:cs="Times New Roman" w:eastAsia="Times New Roman" w:hAnsi="Times New Roman"/>
+                <w:sz w:val="20"/>
+                <w:szCs w:val="20"/>
+              </w:rPr>
+              <w:t xml:space="preserve">pb-3</w:t>
             </w:r>
           </w:p>
         </w:tc>
@@ -4701,7 +4953,7 @@
           <w:p>
             <w:pPr>
               <w:spacing w:after="0" w:line="250"/>
-              <w:jc w:val="left"/>
+              <w:jc w:val="center"/>
             </w:pPr>
             <w:r>
               <w:rPr>
@@ -4710,6 +4962,68 @@
                 <w:szCs w:val="20"/>
               </w:rPr>
               <w:t xml:space="preserve">4</w:t>
+            </w:r>
+          </w:p>
+        </w:tc>
+        <w:tc>
+          <w:tcPr>
+            <w:tcBorders>
+              <w:top w:val="single" w:color="BFBFBF" w:sz="4"/>
+              <w:left w:val="single" w:color="BFBFBF" w:sz="4"/>
+              <w:bottom w:val="single" w:color="BFBFBF" w:sz="4"/>
+              <w:right w:val="single" w:color="BFBFBF" w:sz="4"/>
+            </w:tcBorders>
+            <w:shd w:fill="F2F2F2" w:color="auto" w:val="clear"/>
+            <w:tcMar>
+              <w:top w:type="dxa" w:w="40"/>
+              <w:left w:type="dxa" w:w="80"/>
+              <w:bottom w:type="dxa" w:w="40"/>
+              <w:right w:type="dxa" w:w="80"/>
+            </w:tcMar>
+          </w:tcPr>
+          <w:p>
+            <w:pPr>
+              <w:spacing w:after="0" w:line="250"/>
+              <w:jc w:val="center"/>
+            </w:pPr>
+            <w:r>
+              <w:rPr>
+                <w:rFonts w:ascii="Times New Roman" w:cs="Times New Roman" w:eastAsia="Times New Roman" w:hAnsi="Times New Roman"/>
+                <w:sz w:val="20"/>
+                <w:szCs w:val="20"/>
+              </w:rPr>
+              <w:t xml:space="preserve">Sprint 1</w:t>
+            </w:r>
+          </w:p>
+        </w:tc>
+        <w:tc>
+          <w:tcPr>
+            <w:tcBorders>
+              <w:top w:val="single" w:color="BFBFBF" w:sz="4"/>
+              <w:left w:val="single" w:color="BFBFBF" w:sz="4"/>
+              <w:bottom w:val="single" w:color="BFBFBF" w:sz="4"/>
+              <w:right w:val="single" w:color="BFBFBF" w:sz="4"/>
+            </w:tcBorders>
+            <w:shd w:fill="F2F2F2" w:color="auto" w:val="clear"/>
+            <w:tcMar>
+              <w:top w:type="dxa" w:w="40"/>
+              <w:left w:type="dxa" w:w="80"/>
+              <w:bottom w:type="dxa" w:w="40"/>
+              <w:right w:type="dxa" w:w="80"/>
+            </w:tcMar>
+          </w:tcPr>
+          <w:p>
+            <w:pPr>
+              <w:spacing w:after="0" w:line="250"/>
+              <w:jc w:val="center"/>
+            </w:pPr>
+            <w:r>
+              <w:rPr>
+                <w:rFonts w:ascii="Times New Roman" w:cs="Times New Roman" w:eastAsia="Times New Roman" w:hAnsi="Times New Roman"/>
+                <w:sz w:val="20"/>
+                <w:szCs w:val="20"/>
+              </w:rPr>
+              <w:t xml:space="preserve">pb-3</w:t>
             </w:r>
           </w:p>
         </w:tc>
@@ -4826,7 +5140,7 @@
           <w:p>
             <w:pPr>
               <w:spacing w:after="0" w:line="250"/>
-              <w:jc w:val="left"/>
+              <w:jc w:val="center"/>
             </w:pPr>
             <w:r>
               <w:rPr>
@@ -4835,6 +5149,66 @@
                 <w:szCs w:val="20"/>
               </w:rPr>
               <w:t xml:space="preserve">5</w:t>
+            </w:r>
+          </w:p>
+        </w:tc>
+        <w:tc>
+          <w:tcPr>
+            <w:tcBorders>
+              <w:top w:val="single" w:color="BFBFBF" w:sz="4"/>
+              <w:left w:val="single" w:color="BFBFBF" w:sz="4"/>
+              <w:bottom w:val="single" w:color="BFBFBF" w:sz="4"/>
+              <w:right w:val="single" w:color="BFBFBF" w:sz="4"/>
+            </w:tcBorders>
+            <w:tcMar>
+              <w:top w:type="dxa" w:w="40"/>
+              <w:left w:type="dxa" w:w="80"/>
+              <w:bottom w:type="dxa" w:w="40"/>
+              <w:right w:type="dxa" w:w="80"/>
+            </w:tcMar>
+          </w:tcPr>
+          <w:p>
+            <w:pPr>
+              <w:spacing w:after="0" w:line="250"/>
+              <w:jc w:val="center"/>
+            </w:pPr>
+            <w:r>
+              <w:rPr>
+                <w:rFonts w:ascii="Times New Roman" w:cs="Times New Roman" w:eastAsia="Times New Roman" w:hAnsi="Times New Roman"/>
+                <w:sz w:val="20"/>
+                <w:szCs w:val="20"/>
+              </w:rPr>
+              <w:t xml:space="preserve">Sprint 1</w:t>
+            </w:r>
+          </w:p>
+        </w:tc>
+        <w:tc>
+          <w:tcPr>
+            <w:tcBorders>
+              <w:top w:val="single" w:color="BFBFBF" w:sz="4"/>
+              <w:left w:val="single" w:color="BFBFBF" w:sz="4"/>
+              <w:bottom w:val="single" w:color="BFBFBF" w:sz="4"/>
+              <w:right w:val="single" w:color="BFBFBF" w:sz="4"/>
+            </w:tcBorders>
+            <w:tcMar>
+              <w:top w:type="dxa" w:w="40"/>
+              <w:left w:type="dxa" w:w="80"/>
+              <w:bottom w:type="dxa" w:w="40"/>
+              <w:right w:type="dxa" w:w="80"/>
+            </w:tcMar>
+          </w:tcPr>
+          <w:p>
+            <w:pPr>
+              <w:spacing w:after="0" w:line="250"/>
+              <w:jc w:val="center"/>
+            </w:pPr>
+            <w:r>
+              <w:rPr>
+                <w:rFonts w:ascii="Times New Roman" w:cs="Times New Roman" w:eastAsia="Times New Roman" w:hAnsi="Times New Roman"/>
+                <w:sz w:val="20"/>
+                <w:szCs w:val="20"/>
+              </w:rPr>
+              <w:t xml:space="preserve">PB-4</w:t>
             </w:r>
           </w:p>
         </w:tc>
@@ -4949,7 +5323,7 @@
           <w:p>
             <w:pPr>
               <w:spacing w:after="0" w:line="250"/>
-              <w:jc w:val="left"/>
+              <w:jc w:val="center"/>
             </w:pPr>
             <w:r>
               <w:rPr>
@@ -4958,6 +5332,68 @@
                 <w:szCs w:val="20"/>
               </w:rPr>
               <w:t xml:space="preserve">6</w:t>
+            </w:r>
+          </w:p>
+        </w:tc>
+        <w:tc>
+          <w:tcPr>
+            <w:tcBorders>
+              <w:top w:val="single" w:color="BFBFBF" w:sz="4"/>
+              <w:left w:val="single" w:color="BFBFBF" w:sz="4"/>
+              <w:bottom w:val="single" w:color="BFBFBF" w:sz="4"/>
+              <w:right w:val="single" w:color="BFBFBF" w:sz="4"/>
+            </w:tcBorders>
+            <w:shd w:fill="F2F2F2" w:color="auto" w:val="clear"/>
+            <w:tcMar>
+              <w:top w:type="dxa" w:w="40"/>
+              <w:left w:type="dxa" w:w="80"/>
+              <w:bottom w:type="dxa" w:w="40"/>
+              <w:right w:type="dxa" w:w="80"/>
+            </w:tcMar>
+          </w:tcPr>
+          <w:p>
+            <w:pPr>
+              <w:spacing w:after="0" w:line="250"/>
+              <w:jc w:val="center"/>
+            </w:pPr>
+            <w:r>
+              <w:rPr>
+                <w:rFonts w:ascii="Times New Roman" w:cs="Times New Roman" w:eastAsia="Times New Roman" w:hAnsi="Times New Roman"/>
+                <w:sz w:val="20"/>
+                <w:szCs w:val="20"/>
+              </w:rPr>
+              <w:t xml:space="preserve">Sprint 2</w:t>
+            </w:r>
+          </w:p>
+        </w:tc>
+        <w:tc>
+          <w:tcPr>
+            <w:tcBorders>
+              <w:top w:val="single" w:color="BFBFBF" w:sz="4"/>
+              <w:left w:val="single" w:color="BFBFBF" w:sz="4"/>
+              <w:bottom w:val="single" w:color="BFBFBF" w:sz="4"/>
+              <w:right w:val="single" w:color="BFBFBF" w:sz="4"/>
+            </w:tcBorders>
+            <w:shd w:fill="F2F2F2" w:color="auto" w:val="clear"/>
+            <w:tcMar>
+              <w:top w:type="dxa" w:w="40"/>
+              <w:left w:type="dxa" w:w="80"/>
+              <w:bottom w:type="dxa" w:w="40"/>
+              <w:right w:type="dxa" w:w="80"/>
+            </w:tcMar>
+          </w:tcPr>
+          <w:p>
+            <w:pPr>
+              <w:spacing w:after="0" w:line="250"/>
+              <w:jc w:val="center"/>
+            </w:pPr>
+            <w:r>
+              <w:rPr>
+                <w:rFonts w:ascii="Times New Roman" w:cs="Times New Roman" w:eastAsia="Times New Roman" w:hAnsi="Times New Roman"/>
+                <w:sz w:val="20"/>
+                <w:szCs w:val="20"/>
+              </w:rPr>
+              <w:t xml:space="preserve">PB-5</w:t>
             </w:r>
           </w:p>
         </w:tc>
@@ -5074,7 +5510,7 @@
           <w:p>
             <w:pPr>
               <w:spacing w:after="0" w:line="250"/>
-              <w:jc w:val="left"/>
+              <w:jc w:val="center"/>
             </w:pPr>
             <w:r>
               <w:rPr>
@@ -5083,6 +5519,66 @@
                 <w:szCs w:val="20"/>
               </w:rPr>
               <w:t xml:space="preserve">7</w:t>
+            </w:r>
+          </w:p>
+        </w:tc>
+        <w:tc>
+          <w:tcPr>
+            <w:tcBorders>
+              <w:top w:val="single" w:color="BFBFBF" w:sz="4"/>
+              <w:left w:val="single" w:color="BFBFBF" w:sz="4"/>
+              <w:bottom w:val="single" w:color="BFBFBF" w:sz="4"/>
+              <w:right w:val="single" w:color="BFBFBF" w:sz="4"/>
+            </w:tcBorders>
+            <w:tcMar>
+              <w:top w:type="dxa" w:w="40"/>
+              <w:left w:type="dxa" w:w="80"/>
+              <w:bottom w:type="dxa" w:w="40"/>
+              <w:right w:type="dxa" w:w="80"/>
+            </w:tcMar>
+          </w:tcPr>
+          <w:p>
+            <w:pPr>
+              <w:spacing w:after="0" w:line="250"/>
+              <w:jc w:val="center"/>
+            </w:pPr>
+            <w:r>
+              <w:rPr>
+                <w:rFonts w:ascii="Times New Roman" w:cs="Times New Roman" w:eastAsia="Times New Roman" w:hAnsi="Times New Roman"/>
+                <w:sz w:val="20"/>
+                <w:szCs w:val="20"/>
+              </w:rPr>
+              <w:t xml:space="preserve">Sprint 2</w:t>
+            </w:r>
+          </w:p>
+        </w:tc>
+        <w:tc>
+          <w:tcPr>
+            <w:tcBorders>
+              <w:top w:val="single" w:color="BFBFBF" w:sz="4"/>
+              <w:left w:val="single" w:color="BFBFBF" w:sz="4"/>
+              <w:bottom w:val="single" w:color="BFBFBF" w:sz="4"/>
+              <w:right w:val="single" w:color="BFBFBF" w:sz="4"/>
+            </w:tcBorders>
+            <w:tcMar>
+              <w:top w:type="dxa" w:w="40"/>
+              <w:left w:type="dxa" w:w="80"/>
+              <w:bottom w:type="dxa" w:w="40"/>
+              <w:right w:type="dxa" w:w="80"/>
+            </w:tcMar>
+          </w:tcPr>
+          <w:p>
+            <w:pPr>
+              <w:spacing w:after="0" w:line="250"/>
+              <w:jc w:val="center"/>
+            </w:pPr>
+            <w:r>
+              <w:rPr>
+                <w:rFonts w:ascii="Times New Roman" w:cs="Times New Roman" w:eastAsia="Times New Roman" w:hAnsi="Times New Roman"/>
+                <w:sz w:val="20"/>
+                <w:szCs w:val="20"/>
+              </w:rPr>
+              <w:t xml:space="preserve">PB-5</w:t>
             </w:r>
           </w:p>
         </w:tc>
@@ -5197,7 +5693,7 @@
           <w:p>
             <w:pPr>
               <w:spacing w:after="0" w:line="250"/>
-              <w:jc w:val="left"/>
+              <w:jc w:val="center"/>
             </w:pPr>
             <w:r>
               <w:rPr>
@@ -5206,6 +5702,68 @@
                 <w:szCs w:val="20"/>
               </w:rPr>
               <w:t xml:space="preserve">8</w:t>
+            </w:r>
+          </w:p>
+        </w:tc>
+        <w:tc>
+          <w:tcPr>
+            <w:tcBorders>
+              <w:top w:val="single" w:color="BFBFBF" w:sz="4"/>
+              <w:left w:val="single" w:color="BFBFBF" w:sz="4"/>
+              <w:bottom w:val="single" w:color="BFBFBF" w:sz="4"/>
+              <w:right w:val="single" w:color="BFBFBF" w:sz="4"/>
+            </w:tcBorders>
+            <w:shd w:fill="F2F2F2" w:color="auto" w:val="clear"/>
+            <w:tcMar>
+              <w:top w:type="dxa" w:w="40"/>
+              <w:left w:type="dxa" w:w="80"/>
+              <w:bottom w:type="dxa" w:w="40"/>
+              <w:right w:type="dxa" w:w="80"/>
+            </w:tcMar>
+          </w:tcPr>
+          <w:p>
+            <w:pPr>
+              <w:spacing w:after="0" w:line="250"/>
+              <w:jc w:val="center"/>
+            </w:pPr>
+            <w:r>
+              <w:rPr>
+                <w:rFonts w:ascii="Times New Roman" w:cs="Times New Roman" w:eastAsia="Times New Roman" w:hAnsi="Times New Roman"/>
+                <w:sz w:val="20"/>
+                <w:szCs w:val="20"/>
+              </w:rPr>
+              <w:t xml:space="preserve">Sprint 2</w:t>
+            </w:r>
+          </w:p>
+        </w:tc>
+        <w:tc>
+          <w:tcPr>
+            <w:tcBorders>
+              <w:top w:val="single" w:color="BFBFBF" w:sz="4"/>
+              <w:left w:val="single" w:color="BFBFBF" w:sz="4"/>
+              <w:bottom w:val="single" w:color="BFBFBF" w:sz="4"/>
+              <w:right w:val="single" w:color="BFBFBF" w:sz="4"/>
+            </w:tcBorders>
+            <w:shd w:fill="F2F2F2" w:color="auto" w:val="clear"/>
+            <w:tcMar>
+              <w:top w:type="dxa" w:w="40"/>
+              <w:left w:type="dxa" w:w="80"/>
+              <w:bottom w:type="dxa" w:w="40"/>
+              <w:right w:type="dxa" w:w="80"/>
+            </w:tcMar>
+          </w:tcPr>
+          <w:p>
+            <w:pPr>
+              <w:spacing w:after="0" w:line="250"/>
+              <w:jc w:val="center"/>
+            </w:pPr>
+            <w:r>
+              <w:rPr>
+                <w:rFonts w:ascii="Times New Roman" w:cs="Times New Roman" w:eastAsia="Times New Roman" w:hAnsi="Times New Roman"/>
+                <w:sz w:val="20"/>
+                <w:szCs w:val="20"/>
+              </w:rPr>
+              <w:t xml:space="preserve">PB-6</w:t>
             </w:r>
           </w:p>
         </w:tc>
@@ -5322,7 +5880,7 @@
           <w:p>
             <w:pPr>
               <w:spacing w:after="0" w:line="250"/>
-              <w:jc w:val="left"/>
+              <w:jc w:val="center"/>
             </w:pPr>
             <w:r>
               <w:rPr>
@@ -5331,6 +5889,66 @@
                 <w:szCs w:val="20"/>
               </w:rPr>
               <w:t xml:space="preserve">9</w:t>
+            </w:r>
+          </w:p>
+        </w:tc>
+        <w:tc>
+          <w:tcPr>
+            <w:tcBorders>
+              <w:top w:val="single" w:color="BFBFBF" w:sz="4"/>
+              <w:left w:val="single" w:color="BFBFBF" w:sz="4"/>
+              <w:bottom w:val="single" w:color="BFBFBF" w:sz="4"/>
+              <w:right w:val="single" w:color="BFBFBF" w:sz="4"/>
+            </w:tcBorders>
+            <w:tcMar>
+              <w:top w:type="dxa" w:w="40"/>
+              <w:left w:type="dxa" w:w="80"/>
+              <w:bottom w:type="dxa" w:w="40"/>
+              <w:right w:type="dxa" w:w="80"/>
+            </w:tcMar>
+          </w:tcPr>
+          <w:p>
+            <w:pPr>
+              <w:spacing w:after="0" w:line="250"/>
+              <w:jc w:val="center"/>
+            </w:pPr>
+            <w:r>
+              <w:rPr>
+                <w:rFonts w:ascii="Times New Roman" w:cs="Times New Roman" w:eastAsia="Times New Roman" w:hAnsi="Times New Roman"/>
+                <w:sz w:val="20"/>
+                <w:szCs w:val="20"/>
+              </w:rPr>
+              <w:t xml:space="preserve">Sprint 3</w:t>
+            </w:r>
+          </w:p>
+        </w:tc>
+        <w:tc>
+          <w:tcPr>
+            <w:tcBorders>
+              <w:top w:val="single" w:color="BFBFBF" w:sz="4"/>
+              <w:left w:val="single" w:color="BFBFBF" w:sz="4"/>
+              <w:bottom w:val="single" w:color="BFBFBF" w:sz="4"/>
+              <w:right w:val="single" w:color="BFBFBF" w:sz="4"/>
+            </w:tcBorders>
+            <w:tcMar>
+              <w:top w:type="dxa" w:w="40"/>
+              <w:left w:type="dxa" w:w="80"/>
+              <w:bottom w:type="dxa" w:w="40"/>
+              <w:right w:type="dxa" w:w="80"/>
+            </w:tcMar>
+          </w:tcPr>
+          <w:p>
+            <w:pPr>
+              <w:spacing w:after="0" w:line="250"/>
+              <w:jc w:val="center"/>
+            </w:pPr>
+            <w:r>
+              <w:rPr>
+                <w:rFonts w:ascii="Times New Roman" w:cs="Times New Roman" w:eastAsia="Times New Roman" w:hAnsi="Times New Roman"/>
+                <w:sz w:val="20"/>
+                <w:szCs w:val="20"/>
+              </w:rPr>
+              <w:t xml:space="preserve">PB-7</w:t>
             </w:r>
           </w:p>
         </w:tc>
@@ -5445,7 +6063,7 @@
           <w:p>
             <w:pPr>
               <w:spacing w:after="0" w:line="250"/>
-              <w:jc w:val="left"/>
+              <w:jc w:val="center"/>
             </w:pPr>
             <w:r>
               <w:rPr>
@@ -5454,6 +6072,68 @@
                 <w:szCs w:val="20"/>
               </w:rPr>
               <w:t xml:space="preserve">10</w:t>
+            </w:r>
+          </w:p>
+        </w:tc>
+        <w:tc>
+          <w:tcPr>
+            <w:tcBorders>
+              <w:top w:val="single" w:color="BFBFBF" w:sz="4"/>
+              <w:left w:val="single" w:color="BFBFBF" w:sz="4"/>
+              <w:bottom w:val="single" w:color="BFBFBF" w:sz="4"/>
+              <w:right w:val="single" w:color="BFBFBF" w:sz="4"/>
+            </w:tcBorders>
+            <w:shd w:fill="F2F2F2" w:color="auto" w:val="clear"/>
+            <w:tcMar>
+              <w:top w:type="dxa" w:w="40"/>
+              <w:left w:type="dxa" w:w="80"/>
+              <w:bottom w:type="dxa" w:w="40"/>
+              <w:right w:type="dxa" w:w="80"/>
+            </w:tcMar>
+          </w:tcPr>
+          <w:p>
+            <w:pPr>
+              <w:spacing w:after="0" w:line="250"/>
+              <w:jc w:val="center"/>
+            </w:pPr>
+            <w:r>
+              <w:rPr>
+                <w:rFonts w:ascii="Times New Roman" w:cs="Times New Roman" w:eastAsia="Times New Roman" w:hAnsi="Times New Roman"/>
+                <w:sz w:val="20"/>
+                <w:szCs w:val="20"/>
+              </w:rPr>
+              <w:t xml:space="preserve">Sprint 3</w:t>
+            </w:r>
+          </w:p>
+        </w:tc>
+        <w:tc>
+          <w:tcPr>
+            <w:tcBorders>
+              <w:top w:val="single" w:color="BFBFBF" w:sz="4"/>
+              <w:left w:val="single" w:color="BFBFBF" w:sz="4"/>
+              <w:bottom w:val="single" w:color="BFBFBF" w:sz="4"/>
+              <w:right w:val="single" w:color="BFBFBF" w:sz="4"/>
+            </w:tcBorders>
+            <w:shd w:fill="F2F2F2" w:color="auto" w:val="clear"/>
+            <w:tcMar>
+              <w:top w:type="dxa" w:w="40"/>
+              <w:left w:type="dxa" w:w="80"/>
+              <w:bottom w:type="dxa" w:w="40"/>
+              <w:right w:type="dxa" w:w="80"/>
+            </w:tcMar>
+          </w:tcPr>
+          <w:p>
+            <w:pPr>
+              <w:spacing w:after="0" w:line="250"/>
+              <w:jc w:val="center"/>
+            </w:pPr>
+            <w:r>
+              <w:rPr>
+                <w:rFonts w:ascii="Times New Roman" w:cs="Times New Roman" w:eastAsia="Times New Roman" w:hAnsi="Times New Roman"/>
+                <w:sz w:val="20"/>
+                <w:szCs w:val="20"/>
+              </w:rPr>
+              <w:t xml:space="preserve">PB-8</w:t>
             </w:r>
           </w:p>
         </w:tc>
@@ -7272,7 +7952,20 @@
           <w:sz w:val="26"/>
           <w:szCs w:val="26"/>
         </w:rPr>
-        <w:t xml:space="preserve">1. Ma trận truy vết Yêu cầu → Test case</w:t>
+        <w:t xml:space="preserve">1. Ma trận truy vết Sprint → PB → Yêu cầu → Test case</w:t>
+      </w:r>
+    </w:p>
+    <w:p>
+      <w:pPr>
+        <w:spacing w:after="120" w:before="0" w:line="276"/>
+      </w:pPr>
+      <w:r>
+        <w:rPr>
+          <w:rFonts w:ascii="Times New Roman" w:cs="Times New Roman" w:eastAsia="Times New Roman" w:hAnsi="Times New Roman"/>
+          <w:sz w:val="24"/>
+          <w:szCs w:val="24"/>
+        </w:rPr>
+        <w:t xml:space="preserve">Các cột Sprint, PB (Product Backlog) và RQ (User Story) khớp với sheet "ws4.1 sprints" trong Product Backlog gốc (2607lts_nhóm 1_WebBshoes.xlsx).</w:t>
       </w:r>
     </w:p>
     <w:tbl>
@@ -7288,12 +7981,14 @@
         </w:tblBorders>
       </w:tblPr>
       <w:tblGrid>
-        <w:gridCol w:w="26"/>
-        <w:gridCol w:w="30"/>
-        <w:gridCol w:w="11"/>
-        <w:gridCol w:w="11"/>
-        <w:gridCol w:w="11"/>
-        <w:gridCol w:w="11"/>
+        <w:gridCol w:w="10"/>
+        <w:gridCol w:w="10"/>
+        <w:gridCol w:w="20"/>
+        <w:gridCol w:w="22"/>
+        <w:gridCol w:w="18"/>
+        <w:gridCol w:w="8"/>
+        <w:gridCol w:w="6"/>
+        <w:gridCol w:w="6"/>
       </w:tblGrid>
       <w:tr>
         <w:trPr>
@@ -7329,7 +8024,7 @@
                 <w:sz w:val="20"/>
                 <w:szCs w:val="20"/>
               </w:rPr>
-              <w:t xml:space="preserve">Yêu cầu (RQ)</w:t>
+              <w:t xml:space="preserve">Sprint</w:t>
             </w:r>
           </w:p>
         </w:tc>
@@ -7363,7 +8058,7 @@
                 <w:sz w:val="20"/>
                 <w:szCs w:val="20"/>
               </w:rPr>
-              <w:t xml:space="preserve">Module</w:t>
+              <w:t xml:space="preserve">PB</w:t>
             </w:r>
           </w:p>
         </w:tc>
@@ -7397,7 +8092,7 @@
                 <w:sz w:val="20"/>
                 <w:szCs w:val="20"/>
               </w:rPr>
-              <w:t xml:space="preserve">Số TC</w:t>
+              <w:t xml:space="preserve">User Story (RQ)</w:t>
             </w:r>
           </w:p>
         </w:tc>
@@ -7431,7 +8126,7 @@
                 <w:sz w:val="20"/>
                 <w:szCs w:val="20"/>
               </w:rPr>
-              <w:t xml:space="preserve">Pass</w:t>
+              <w:t xml:space="preserve">Module</w:t>
             </w:r>
           </w:p>
         </w:tc>
@@ -7465,7 +8160,7 @@
                 <w:sz w:val="20"/>
                 <w:szCs w:val="20"/>
               </w:rPr>
-              <w:t xml:space="preserve">Fail</w:t>
+              <w:t xml:space="preserve">Mã Test case</w:t>
             </w:r>
           </w:p>
         </w:tc>
@@ -7499,7 +8194,75 @@
                 <w:sz w:val="20"/>
                 <w:szCs w:val="20"/>
               </w:rPr>
-              <w:t xml:space="preserve">Pass rate</w:t>
+              <w:t xml:space="preserve">Số TC</w:t>
+            </w:r>
+          </w:p>
+        </w:tc>
+        <w:tc>
+          <w:tcPr>
+            <w:tcBorders>
+              <w:top w:val="single" w:color="BFBFBF" w:sz="4"/>
+              <w:left w:val="single" w:color="BFBFBF" w:sz="4"/>
+              <w:bottom w:val="single" w:color="BFBFBF" w:sz="4"/>
+              <w:right w:val="single" w:color="BFBFBF" w:sz="4"/>
+            </w:tcBorders>
+            <w:shd w:fill="1F3864" w:color="auto" w:val="clear"/>
+            <w:tcMar>
+              <w:top w:type="dxa" w:w="40"/>
+              <w:left w:type="dxa" w:w="80"/>
+              <w:bottom w:type="dxa" w:w="40"/>
+              <w:right w:type="dxa" w:w="80"/>
+            </w:tcMar>
+          </w:tcPr>
+          <w:p>
+            <w:pPr>
+              <w:spacing w:after="0" w:line="250"/>
+              <w:jc w:val="center"/>
+            </w:pPr>
+            <w:r>
+              <w:rPr>
+                <w:rFonts w:ascii="Times New Roman" w:cs="Times New Roman" w:eastAsia="Times New Roman" w:hAnsi="Times New Roman"/>
+                <w:b/>
+                <w:bCs/>
+                <w:color w:val="FFFFFF"/>
+                <w:sz w:val="20"/>
+                <w:szCs w:val="20"/>
+              </w:rPr>
+              <w:t xml:space="preserve">Pass</w:t>
+            </w:r>
+          </w:p>
+        </w:tc>
+        <w:tc>
+          <w:tcPr>
+            <w:tcBorders>
+              <w:top w:val="single" w:color="BFBFBF" w:sz="4"/>
+              <w:left w:val="single" w:color="BFBFBF" w:sz="4"/>
+              <w:bottom w:val="single" w:color="BFBFBF" w:sz="4"/>
+              <w:right w:val="single" w:color="BFBFBF" w:sz="4"/>
+            </w:tcBorders>
+            <w:shd w:fill="1F3864" w:color="auto" w:val="clear"/>
+            <w:tcMar>
+              <w:top w:type="dxa" w:w="40"/>
+              <w:left w:type="dxa" w:w="80"/>
+              <w:bottom w:type="dxa" w:w="40"/>
+              <w:right w:type="dxa" w:w="80"/>
+            </w:tcMar>
+          </w:tcPr>
+          <w:p>
+            <w:pPr>
+              <w:spacing w:after="0" w:line="250"/>
+              <w:jc w:val="center"/>
+            </w:pPr>
+            <w:r>
+              <w:rPr>
+                <w:rFonts w:ascii="Times New Roman" w:cs="Times New Roman" w:eastAsia="Times New Roman" w:hAnsi="Times New Roman"/>
+                <w:b/>
+                <w:bCs/>
+                <w:color w:val="FFFFFF"/>
+                <w:sz w:val="20"/>
+                <w:szCs w:val="20"/>
+              </w:rPr>
+              <w:t xml:space="preserve">Fail</w:t>
             </w:r>
           </w:p>
         </w:tc>
@@ -7523,6 +8286,66 @@
           <w:p>
             <w:pPr>
               <w:spacing w:after="0" w:line="250"/>
+              <w:jc w:val="center"/>
+            </w:pPr>
+            <w:r>
+              <w:rPr>
+                <w:rFonts w:ascii="Times New Roman" w:cs="Times New Roman" w:eastAsia="Times New Roman" w:hAnsi="Times New Roman"/>
+                <w:sz w:val="20"/>
+                <w:szCs w:val="20"/>
+              </w:rPr>
+              <w:t xml:space="preserve">Sprint 1</w:t>
+            </w:r>
+          </w:p>
+        </w:tc>
+        <w:tc>
+          <w:tcPr>
+            <w:tcBorders>
+              <w:top w:val="single" w:color="BFBFBF" w:sz="4"/>
+              <w:left w:val="single" w:color="BFBFBF" w:sz="4"/>
+              <w:bottom w:val="single" w:color="BFBFBF" w:sz="4"/>
+              <w:right w:val="single" w:color="BFBFBF" w:sz="4"/>
+            </w:tcBorders>
+            <w:tcMar>
+              <w:top w:type="dxa" w:w="40"/>
+              <w:left w:type="dxa" w:w="80"/>
+              <w:bottom w:type="dxa" w:w="40"/>
+              <w:right w:type="dxa" w:w="80"/>
+            </w:tcMar>
+          </w:tcPr>
+          <w:p>
+            <w:pPr>
+              <w:spacing w:after="0" w:line="250"/>
+              <w:jc w:val="center"/>
+            </w:pPr>
+            <w:r>
+              <w:rPr>
+                <w:rFonts w:ascii="Times New Roman" w:cs="Times New Roman" w:eastAsia="Times New Roman" w:hAnsi="Times New Roman"/>
+                <w:sz w:val="20"/>
+                <w:szCs w:val="20"/>
+              </w:rPr>
+              <w:t xml:space="preserve">pb-1</w:t>
+            </w:r>
+          </w:p>
+        </w:tc>
+        <w:tc>
+          <w:tcPr>
+            <w:tcBorders>
+              <w:top w:val="single" w:color="BFBFBF" w:sz="4"/>
+              <w:left w:val="single" w:color="BFBFBF" w:sz="4"/>
+              <w:bottom w:val="single" w:color="BFBFBF" w:sz="4"/>
+              <w:right w:val="single" w:color="BFBFBF" w:sz="4"/>
+            </w:tcBorders>
+            <w:tcMar>
+              <w:top w:type="dxa" w:w="40"/>
+              <w:left w:type="dxa" w:w="80"/>
+              <w:bottom w:type="dxa" w:w="40"/>
+              <w:right w:type="dxa" w:w="80"/>
+            </w:tcMar>
+          </w:tcPr>
+          <w:p>
+            <w:pPr>
+              <w:spacing w:after="0" w:line="250"/>
               <w:jc w:val="left"/>
             </w:pPr>
             <w:r>
@@ -7562,6 +8385,36 @@
                 <w:szCs w:val="20"/>
               </w:rPr>
               <w:t xml:space="preserve">Đăng nhập</w:t>
+            </w:r>
+          </w:p>
+        </w:tc>
+        <w:tc>
+          <w:tcPr>
+            <w:tcBorders>
+              <w:top w:val="single" w:color="BFBFBF" w:sz="4"/>
+              <w:left w:val="single" w:color="BFBFBF" w:sz="4"/>
+              <w:bottom w:val="single" w:color="BFBFBF" w:sz="4"/>
+              <w:right w:val="single" w:color="BFBFBF" w:sz="4"/>
+            </w:tcBorders>
+            <w:tcMar>
+              <w:top w:type="dxa" w:w="40"/>
+              <w:left w:type="dxa" w:w="80"/>
+              <w:bottom w:type="dxa" w:w="40"/>
+              <w:right w:type="dxa" w:w="80"/>
+            </w:tcMar>
+          </w:tcPr>
+          <w:p>
+            <w:pPr>
+              <w:spacing w:after="0" w:line="250"/>
+              <w:jc w:val="center"/>
+            </w:pPr>
+            <w:r>
+              <w:rPr>
+                <w:rFonts w:ascii="Times New Roman" w:cs="Times New Roman" w:eastAsia="Times New Roman" w:hAnsi="Times New Roman"/>
+                <w:sz w:val="20"/>
+                <w:szCs w:val="20"/>
+              </w:rPr>
+              <w:t xml:space="preserve">DN_01→DN_13</w:t>
             </w:r>
           </w:p>
         </w:tc>
@@ -7661,36 +8514,6 @@
             </w:r>
           </w:p>
         </w:tc>
-        <w:tc>
-          <w:tcPr>
-            <w:tcBorders>
-              <w:top w:val="single" w:color="BFBFBF" w:sz="4"/>
-              <w:left w:val="single" w:color="BFBFBF" w:sz="4"/>
-              <w:bottom w:val="single" w:color="BFBFBF" w:sz="4"/>
-              <w:right w:val="single" w:color="BFBFBF" w:sz="4"/>
-            </w:tcBorders>
-            <w:tcMar>
-              <w:top w:type="dxa" w:w="40"/>
-              <w:left w:type="dxa" w:w="80"/>
-              <w:bottom w:type="dxa" w:w="40"/>
-              <w:right w:type="dxa" w:w="80"/>
-            </w:tcMar>
-          </w:tcPr>
-          <w:p>
-            <w:pPr>
-              <w:spacing w:after="0" w:line="250"/>
-              <w:jc w:val="center"/>
-            </w:pPr>
-            <w:r>
-              <w:rPr>
-                <w:rFonts w:ascii="Times New Roman" w:cs="Times New Roman" w:eastAsia="Times New Roman" w:hAnsi="Times New Roman"/>
-                <w:sz w:val="20"/>
-                <w:szCs w:val="20"/>
-              </w:rPr>
-              <w:t xml:space="preserve">92%</w:t>
-            </w:r>
-          </w:p>
-        </w:tc>
       </w:tr>
       <w:tr>
         <w:tc>
@@ -7712,6 +8535,68 @@
           <w:p>
             <w:pPr>
               <w:spacing w:after="0" w:line="250"/>
+              <w:jc w:val="center"/>
+            </w:pPr>
+            <w:r>
+              <w:rPr>
+                <w:rFonts w:ascii="Times New Roman" w:cs="Times New Roman" w:eastAsia="Times New Roman" w:hAnsi="Times New Roman"/>
+                <w:sz w:val="20"/>
+                <w:szCs w:val="20"/>
+              </w:rPr>
+              <w:t xml:space="preserve">Sprint 1</w:t>
+            </w:r>
+          </w:p>
+        </w:tc>
+        <w:tc>
+          <w:tcPr>
+            <w:tcBorders>
+              <w:top w:val="single" w:color="BFBFBF" w:sz="4"/>
+              <w:left w:val="single" w:color="BFBFBF" w:sz="4"/>
+              <w:bottom w:val="single" w:color="BFBFBF" w:sz="4"/>
+              <w:right w:val="single" w:color="BFBFBF" w:sz="4"/>
+            </w:tcBorders>
+            <w:shd w:fill="F2F2F2" w:color="auto" w:val="clear"/>
+            <w:tcMar>
+              <w:top w:type="dxa" w:w="40"/>
+              <w:left w:type="dxa" w:w="80"/>
+              <w:bottom w:type="dxa" w:w="40"/>
+              <w:right w:type="dxa" w:w="80"/>
+            </w:tcMar>
+          </w:tcPr>
+          <w:p>
+            <w:pPr>
+              <w:spacing w:after="0" w:line="250"/>
+              <w:jc w:val="center"/>
+            </w:pPr>
+            <w:r>
+              <w:rPr>
+                <w:rFonts w:ascii="Times New Roman" w:cs="Times New Roman" w:eastAsia="Times New Roman" w:hAnsi="Times New Roman"/>
+                <w:sz w:val="20"/>
+                <w:szCs w:val="20"/>
+              </w:rPr>
+              <w:t xml:space="preserve">pb-2</w:t>
+            </w:r>
+          </w:p>
+        </w:tc>
+        <w:tc>
+          <w:tcPr>
+            <w:tcBorders>
+              <w:top w:val="single" w:color="BFBFBF" w:sz="4"/>
+              <w:left w:val="single" w:color="BFBFBF" w:sz="4"/>
+              <w:bottom w:val="single" w:color="BFBFBF" w:sz="4"/>
+              <w:right w:val="single" w:color="BFBFBF" w:sz="4"/>
+            </w:tcBorders>
+            <w:shd w:fill="F2F2F2" w:color="auto" w:val="clear"/>
+            <w:tcMar>
+              <w:top w:type="dxa" w:w="40"/>
+              <w:left w:type="dxa" w:w="80"/>
+              <w:bottom w:type="dxa" w:w="40"/>
+              <w:right w:type="dxa" w:w="80"/>
+            </w:tcMar>
+          </w:tcPr>
+          <w:p>
+            <w:pPr>
+              <w:spacing w:after="0" w:line="250"/>
               <w:jc w:val="left"/>
             </w:pPr>
             <w:r>
@@ -7752,6 +8637,37 @@
                 <w:szCs w:val="20"/>
               </w:rPr>
               <w:t xml:space="preserve">Quản lý nhân viên</w:t>
+            </w:r>
+          </w:p>
+        </w:tc>
+        <w:tc>
+          <w:tcPr>
+            <w:tcBorders>
+              <w:top w:val="single" w:color="BFBFBF" w:sz="4"/>
+              <w:left w:val="single" w:color="BFBFBF" w:sz="4"/>
+              <w:bottom w:val="single" w:color="BFBFBF" w:sz="4"/>
+              <w:right w:val="single" w:color="BFBFBF" w:sz="4"/>
+            </w:tcBorders>
+            <w:shd w:fill="F2F2F2" w:color="auto" w:val="clear"/>
+            <w:tcMar>
+              <w:top w:type="dxa" w:w="40"/>
+              <w:left w:type="dxa" w:w="80"/>
+              <w:bottom w:type="dxa" w:w="40"/>
+              <w:right w:type="dxa" w:w="80"/>
+            </w:tcMar>
+          </w:tcPr>
+          <w:p>
+            <w:pPr>
+              <w:spacing w:after="0" w:line="250"/>
+              <w:jc w:val="center"/>
+            </w:pPr>
+            <w:r>
+              <w:rPr>
+                <w:rFonts w:ascii="Times New Roman" w:cs="Times New Roman" w:eastAsia="Times New Roman" w:hAnsi="Times New Roman"/>
+                <w:sz w:val="20"/>
+                <w:szCs w:val="20"/>
+              </w:rPr>
+              <w:t xml:space="preserve">NV_01→NV_14</w:t>
             </w:r>
           </w:p>
         </w:tc>
@@ -7854,37 +8770,6 @@
             </w:r>
           </w:p>
         </w:tc>
-        <w:tc>
-          <w:tcPr>
-            <w:tcBorders>
-              <w:top w:val="single" w:color="BFBFBF" w:sz="4"/>
-              <w:left w:val="single" w:color="BFBFBF" w:sz="4"/>
-              <w:bottom w:val="single" w:color="BFBFBF" w:sz="4"/>
-              <w:right w:val="single" w:color="BFBFBF" w:sz="4"/>
-            </w:tcBorders>
-            <w:shd w:fill="F2F2F2" w:color="auto" w:val="clear"/>
-            <w:tcMar>
-              <w:top w:type="dxa" w:w="40"/>
-              <w:left w:type="dxa" w:w="80"/>
-              <w:bottom w:type="dxa" w:w="40"/>
-              <w:right w:type="dxa" w:w="80"/>
-            </w:tcMar>
-          </w:tcPr>
-          <w:p>
-            <w:pPr>
-              <w:spacing w:after="0" w:line="250"/>
-              <w:jc w:val="center"/>
-            </w:pPr>
-            <w:r>
-              <w:rPr>
-                <w:rFonts w:ascii="Times New Roman" w:cs="Times New Roman" w:eastAsia="Times New Roman" w:hAnsi="Times New Roman"/>
-                <w:sz w:val="20"/>
-                <w:szCs w:val="20"/>
-              </w:rPr>
-              <w:t xml:space="preserve">93%</w:t>
-            </w:r>
-          </w:p>
-        </w:tc>
       </w:tr>
       <w:tr>
         <w:tc>
@@ -7905,6 +8790,66 @@
           <w:p>
             <w:pPr>
               <w:spacing w:after="0" w:line="250"/>
+              <w:jc w:val="center"/>
+            </w:pPr>
+            <w:r>
+              <w:rPr>
+                <w:rFonts w:ascii="Times New Roman" w:cs="Times New Roman" w:eastAsia="Times New Roman" w:hAnsi="Times New Roman"/>
+                <w:sz w:val="20"/>
+                <w:szCs w:val="20"/>
+              </w:rPr>
+              <w:t xml:space="preserve">Sprint 1</w:t>
+            </w:r>
+          </w:p>
+        </w:tc>
+        <w:tc>
+          <w:tcPr>
+            <w:tcBorders>
+              <w:top w:val="single" w:color="BFBFBF" w:sz="4"/>
+              <w:left w:val="single" w:color="BFBFBF" w:sz="4"/>
+              <w:bottom w:val="single" w:color="BFBFBF" w:sz="4"/>
+              <w:right w:val="single" w:color="BFBFBF" w:sz="4"/>
+            </w:tcBorders>
+            <w:tcMar>
+              <w:top w:type="dxa" w:w="40"/>
+              <w:left w:type="dxa" w:w="80"/>
+              <w:bottom w:type="dxa" w:w="40"/>
+              <w:right w:type="dxa" w:w="80"/>
+            </w:tcMar>
+          </w:tcPr>
+          <w:p>
+            <w:pPr>
+              <w:spacing w:after="0" w:line="250"/>
+              <w:jc w:val="center"/>
+            </w:pPr>
+            <w:r>
+              <w:rPr>
+                <w:rFonts w:ascii="Times New Roman" w:cs="Times New Roman" w:eastAsia="Times New Roman" w:hAnsi="Times New Roman"/>
+                <w:sz w:val="20"/>
+                <w:szCs w:val="20"/>
+              </w:rPr>
+              <w:t xml:space="preserve">pb-3</w:t>
+            </w:r>
+          </w:p>
+        </w:tc>
+        <w:tc>
+          <w:tcPr>
+            <w:tcBorders>
+              <w:top w:val="single" w:color="BFBFBF" w:sz="4"/>
+              <w:left w:val="single" w:color="BFBFBF" w:sz="4"/>
+              <w:bottom w:val="single" w:color="BFBFBF" w:sz="4"/>
+              <w:right w:val="single" w:color="BFBFBF" w:sz="4"/>
+            </w:tcBorders>
+            <w:tcMar>
+              <w:top w:type="dxa" w:w="40"/>
+              <w:left w:type="dxa" w:w="80"/>
+              <w:bottom w:type="dxa" w:w="40"/>
+              <w:right w:type="dxa" w:w="80"/>
+            </w:tcMar>
+          </w:tcPr>
+          <w:p>
+            <w:pPr>
+              <w:spacing w:after="0" w:line="250"/>
               <w:jc w:val="left"/>
             </w:pPr>
             <w:r>
@@ -7944,6 +8889,36 @@
                 <w:szCs w:val="20"/>
               </w:rPr>
               <w:t xml:space="preserve">Quản lý sản phẩm</w:t>
+            </w:r>
+          </w:p>
+        </w:tc>
+        <w:tc>
+          <w:tcPr>
+            <w:tcBorders>
+              <w:top w:val="single" w:color="BFBFBF" w:sz="4"/>
+              <w:left w:val="single" w:color="BFBFBF" w:sz="4"/>
+              <w:bottom w:val="single" w:color="BFBFBF" w:sz="4"/>
+              <w:right w:val="single" w:color="BFBFBF" w:sz="4"/>
+            </w:tcBorders>
+            <w:tcMar>
+              <w:top w:type="dxa" w:w="40"/>
+              <w:left w:type="dxa" w:w="80"/>
+              <w:bottom w:type="dxa" w:w="40"/>
+              <w:right w:type="dxa" w:w="80"/>
+            </w:tcMar>
+          </w:tcPr>
+          <w:p>
+            <w:pPr>
+              <w:spacing w:after="0" w:line="250"/>
+              <w:jc w:val="center"/>
+            </w:pPr>
+            <w:r>
+              <w:rPr>
+                <w:rFonts w:ascii="Times New Roman" w:cs="Times New Roman" w:eastAsia="Times New Roman" w:hAnsi="Times New Roman"/>
+                <w:sz w:val="20"/>
+                <w:szCs w:val="20"/>
+              </w:rPr>
+              <w:t xml:space="preserve">SP_01→SP_16</w:t>
             </w:r>
           </w:p>
         </w:tc>
@@ -8043,36 +9018,6 @@
             </w:r>
           </w:p>
         </w:tc>
-        <w:tc>
-          <w:tcPr>
-            <w:tcBorders>
-              <w:top w:val="single" w:color="BFBFBF" w:sz="4"/>
-              <w:left w:val="single" w:color="BFBFBF" w:sz="4"/>
-              <w:bottom w:val="single" w:color="BFBFBF" w:sz="4"/>
-              <w:right w:val="single" w:color="BFBFBF" w:sz="4"/>
-            </w:tcBorders>
-            <w:tcMar>
-              <w:top w:type="dxa" w:w="40"/>
-              <w:left w:type="dxa" w:w="80"/>
-              <w:bottom w:type="dxa" w:w="40"/>
-              <w:right w:type="dxa" w:w="80"/>
-            </w:tcMar>
-          </w:tcPr>
-          <w:p>
-            <w:pPr>
-              <w:spacing w:after="0" w:line="250"/>
-              <w:jc w:val="center"/>
-            </w:pPr>
-            <w:r>
-              <w:rPr>
-                <w:rFonts w:ascii="Times New Roman" w:cs="Times New Roman" w:eastAsia="Times New Roman" w:hAnsi="Times New Roman"/>
-                <w:sz w:val="20"/>
-                <w:szCs w:val="20"/>
-              </w:rPr>
-              <w:t xml:space="preserve">88%</w:t>
-            </w:r>
-          </w:p>
-        </w:tc>
       </w:tr>
       <w:tr>
         <w:tc>
@@ -8094,6 +9039,68 @@
           <w:p>
             <w:pPr>
               <w:spacing w:after="0" w:line="250"/>
+              <w:jc w:val="center"/>
+            </w:pPr>
+            <w:r>
+              <w:rPr>
+                <w:rFonts w:ascii="Times New Roman" w:cs="Times New Roman" w:eastAsia="Times New Roman" w:hAnsi="Times New Roman"/>
+                <w:sz w:val="20"/>
+                <w:szCs w:val="20"/>
+              </w:rPr>
+              <w:t xml:space="preserve">Sprint 1</w:t>
+            </w:r>
+          </w:p>
+        </w:tc>
+        <w:tc>
+          <w:tcPr>
+            <w:tcBorders>
+              <w:top w:val="single" w:color="BFBFBF" w:sz="4"/>
+              <w:left w:val="single" w:color="BFBFBF" w:sz="4"/>
+              <w:bottom w:val="single" w:color="BFBFBF" w:sz="4"/>
+              <w:right w:val="single" w:color="BFBFBF" w:sz="4"/>
+            </w:tcBorders>
+            <w:shd w:fill="F2F2F2" w:color="auto" w:val="clear"/>
+            <w:tcMar>
+              <w:top w:type="dxa" w:w="40"/>
+              <w:left w:type="dxa" w:w="80"/>
+              <w:bottom w:type="dxa" w:w="40"/>
+              <w:right w:type="dxa" w:w="80"/>
+            </w:tcMar>
+          </w:tcPr>
+          <w:p>
+            <w:pPr>
+              <w:spacing w:after="0" w:line="250"/>
+              <w:jc w:val="center"/>
+            </w:pPr>
+            <w:r>
+              <w:rPr>
+                <w:rFonts w:ascii="Times New Roman" w:cs="Times New Roman" w:eastAsia="Times New Roman" w:hAnsi="Times New Roman"/>
+                <w:sz w:val="20"/>
+                <w:szCs w:val="20"/>
+              </w:rPr>
+              <w:t xml:space="preserve">pb-3</w:t>
+            </w:r>
+          </w:p>
+        </w:tc>
+        <w:tc>
+          <w:tcPr>
+            <w:tcBorders>
+              <w:top w:val="single" w:color="BFBFBF" w:sz="4"/>
+              <w:left w:val="single" w:color="BFBFBF" w:sz="4"/>
+              <w:bottom w:val="single" w:color="BFBFBF" w:sz="4"/>
+              <w:right w:val="single" w:color="BFBFBF" w:sz="4"/>
+            </w:tcBorders>
+            <w:shd w:fill="F2F2F2" w:color="auto" w:val="clear"/>
+            <w:tcMar>
+              <w:top w:type="dxa" w:w="40"/>
+              <w:left w:type="dxa" w:w="80"/>
+              <w:bottom w:type="dxa" w:w="40"/>
+              <w:right w:type="dxa" w:w="80"/>
+            </w:tcMar>
+          </w:tcPr>
+          <w:p>
+            <w:pPr>
+              <w:spacing w:after="0" w:line="250"/>
               <w:jc w:val="left"/>
             </w:pPr>
             <w:r>
@@ -8134,6 +9141,37 @@
                 <w:szCs w:val="20"/>
               </w:rPr>
               <w:t xml:space="preserve">Danh mục &amp; thuộc tính</w:t>
+            </w:r>
+          </w:p>
+        </w:tc>
+        <w:tc>
+          <w:tcPr>
+            <w:tcBorders>
+              <w:top w:val="single" w:color="BFBFBF" w:sz="4"/>
+              <w:left w:val="single" w:color="BFBFBF" w:sz="4"/>
+              <w:bottom w:val="single" w:color="BFBFBF" w:sz="4"/>
+              <w:right w:val="single" w:color="BFBFBF" w:sz="4"/>
+            </w:tcBorders>
+            <w:shd w:fill="F2F2F2" w:color="auto" w:val="clear"/>
+            <w:tcMar>
+              <w:top w:type="dxa" w:w="40"/>
+              <w:left w:type="dxa" w:w="80"/>
+              <w:bottom w:type="dxa" w:w="40"/>
+              <w:right w:type="dxa" w:w="80"/>
+            </w:tcMar>
+          </w:tcPr>
+          <w:p>
+            <w:pPr>
+              <w:spacing w:after="0" w:line="250"/>
+              <w:jc w:val="center"/>
+            </w:pPr>
+            <w:r>
+              <w:rPr>
+                <w:rFonts w:ascii="Times New Roman" w:cs="Times New Roman" w:eastAsia="Times New Roman" w:hAnsi="Times New Roman"/>
+                <w:sz w:val="20"/>
+                <w:szCs w:val="20"/>
+              </w:rPr>
+              <w:t xml:space="preserve">DMTT_01→DMTT_10</w:t>
             </w:r>
           </w:p>
         </w:tc>
@@ -8236,37 +9274,6 @@
             </w:r>
           </w:p>
         </w:tc>
-        <w:tc>
-          <w:tcPr>
-            <w:tcBorders>
-              <w:top w:val="single" w:color="BFBFBF" w:sz="4"/>
-              <w:left w:val="single" w:color="BFBFBF" w:sz="4"/>
-              <w:bottom w:val="single" w:color="BFBFBF" w:sz="4"/>
-              <w:right w:val="single" w:color="BFBFBF" w:sz="4"/>
-            </w:tcBorders>
-            <w:shd w:fill="F2F2F2" w:color="auto" w:val="clear"/>
-            <w:tcMar>
-              <w:top w:type="dxa" w:w="40"/>
-              <w:left w:type="dxa" w:w="80"/>
-              <w:bottom w:type="dxa" w:w="40"/>
-              <w:right w:type="dxa" w:w="80"/>
-            </w:tcMar>
-          </w:tcPr>
-          <w:p>
-            <w:pPr>
-              <w:spacing w:after="0" w:line="250"/>
-              <w:jc w:val="center"/>
-            </w:pPr>
-            <w:r>
-              <w:rPr>
-                <w:rFonts w:ascii="Times New Roman" w:cs="Times New Roman" w:eastAsia="Times New Roman" w:hAnsi="Times New Roman"/>
-                <w:sz w:val="20"/>
-                <w:szCs w:val="20"/>
-              </w:rPr>
-              <w:t xml:space="preserve">100%</w:t>
-            </w:r>
-          </w:p>
-        </w:tc>
       </w:tr>
       <w:tr>
         <w:tc>
@@ -8287,6 +9294,66 @@
           <w:p>
             <w:pPr>
               <w:spacing w:after="0" w:line="250"/>
+              <w:jc w:val="center"/>
+            </w:pPr>
+            <w:r>
+              <w:rPr>
+                <w:rFonts w:ascii="Times New Roman" w:cs="Times New Roman" w:eastAsia="Times New Roman" w:hAnsi="Times New Roman"/>
+                <w:sz w:val="20"/>
+                <w:szCs w:val="20"/>
+              </w:rPr>
+              <w:t xml:space="preserve">Sprint 1</w:t>
+            </w:r>
+          </w:p>
+        </w:tc>
+        <w:tc>
+          <w:tcPr>
+            <w:tcBorders>
+              <w:top w:val="single" w:color="BFBFBF" w:sz="4"/>
+              <w:left w:val="single" w:color="BFBFBF" w:sz="4"/>
+              <w:bottom w:val="single" w:color="BFBFBF" w:sz="4"/>
+              <w:right w:val="single" w:color="BFBFBF" w:sz="4"/>
+            </w:tcBorders>
+            <w:tcMar>
+              <w:top w:type="dxa" w:w="40"/>
+              <w:left w:type="dxa" w:w="80"/>
+              <w:bottom w:type="dxa" w:w="40"/>
+              <w:right w:type="dxa" w:w="80"/>
+            </w:tcMar>
+          </w:tcPr>
+          <w:p>
+            <w:pPr>
+              <w:spacing w:after="0" w:line="250"/>
+              <w:jc w:val="center"/>
+            </w:pPr>
+            <w:r>
+              <w:rPr>
+                <w:rFonts w:ascii="Times New Roman" w:cs="Times New Roman" w:eastAsia="Times New Roman" w:hAnsi="Times New Roman"/>
+                <w:sz w:val="20"/>
+                <w:szCs w:val="20"/>
+              </w:rPr>
+              <w:t xml:space="preserve">PB-4</w:t>
+            </w:r>
+          </w:p>
+        </w:tc>
+        <w:tc>
+          <w:tcPr>
+            <w:tcBorders>
+              <w:top w:val="single" w:color="BFBFBF" w:sz="4"/>
+              <w:left w:val="single" w:color="BFBFBF" w:sz="4"/>
+              <w:bottom w:val="single" w:color="BFBFBF" w:sz="4"/>
+              <w:right w:val="single" w:color="BFBFBF" w:sz="4"/>
+            </w:tcBorders>
+            <w:tcMar>
+              <w:top w:type="dxa" w:w="40"/>
+              <w:left w:type="dxa" w:w="80"/>
+              <w:bottom w:type="dxa" w:w="40"/>
+              <w:right w:type="dxa" w:w="80"/>
+            </w:tcMar>
+          </w:tcPr>
+          <w:p>
+            <w:pPr>
+              <w:spacing w:after="0" w:line="250"/>
               <w:jc w:val="left"/>
             </w:pPr>
             <w:r>
@@ -8326,6 +9393,36 @@
                 <w:szCs w:val="20"/>
               </w:rPr>
               <w:t xml:space="preserve">Quản lý kho</w:t>
+            </w:r>
+          </w:p>
+        </w:tc>
+        <w:tc>
+          <w:tcPr>
+            <w:tcBorders>
+              <w:top w:val="single" w:color="BFBFBF" w:sz="4"/>
+              <w:left w:val="single" w:color="BFBFBF" w:sz="4"/>
+              <w:bottom w:val="single" w:color="BFBFBF" w:sz="4"/>
+              <w:right w:val="single" w:color="BFBFBF" w:sz="4"/>
+            </w:tcBorders>
+            <w:tcMar>
+              <w:top w:type="dxa" w:w="40"/>
+              <w:left w:type="dxa" w:w="80"/>
+              <w:bottom w:type="dxa" w:w="40"/>
+              <w:right w:type="dxa" w:w="80"/>
+            </w:tcMar>
+          </w:tcPr>
+          <w:p>
+            <w:pPr>
+              <w:spacing w:after="0" w:line="250"/>
+              <w:jc w:val="center"/>
+            </w:pPr>
+            <w:r>
+              <w:rPr>
+                <w:rFonts w:ascii="Times New Roman" w:cs="Times New Roman" w:eastAsia="Times New Roman" w:hAnsi="Times New Roman"/>
+                <w:sz w:val="20"/>
+                <w:szCs w:val="20"/>
+              </w:rPr>
+              <w:t xml:space="preserve">KHO_01→KHO_06</w:t>
             </w:r>
           </w:p>
         </w:tc>
@@ -8425,36 +9522,6 @@
             </w:r>
           </w:p>
         </w:tc>
-        <w:tc>
-          <w:tcPr>
-            <w:tcBorders>
-              <w:top w:val="single" w:color="BFBFBF" w:sz="4"/>
-              <w:left w:val="single" w:color="BFBFBF" w:sz="4"/>
-              <w:bottom w:val="single" w:color="BFBFBF" w:sz="4"/>
-              <w:right w:val="single" w:color="BFBFBF" w:sz="4"/>
-            </w:tcBorders>
-            <w:tcMar>
-              <w:top w:type="dxa" w:w="40"/>
-              <w:left w:type="dxa" w:w="80"/>
-              <w:bottom w:type="dxa" w:w="40"/>
-              <w:right w:type="dxa" w:w="80"/>
-            </w:tcMar>
-          </w:tcPr>
-          <w:p>
-            <w:pPr>
-              <w:spacing w:after="0" w:line="250"/>
-              <w:jc w:val="center"/>
-            </w:pPr>
-            <w:r>
-              <w:rPr>
-                <w:rFonts w:ascii="Times New Roman" w:cs="Times New Roman" w:eastAsia="Times New Roman" w:hAnsi="Times New Roman"/>
-                <w:sz w:val="20"/>
-                <w:szCs w:val="20"/>
-              </w:rPr>
-              <w:t xml:space="preserve">100%</w:t>
-            </w:r>
-          </w:p>
-        </w:tc>
       </w:tr>
       <w:tr>
         <w:tc>
@@ -8476,6 +9543,68 @@
           <w:p>
             <w:pPr>
               <w:spacing w:after="0" w:line="250"/>
+              <w:jc w:val="center"/>
+            </w:pPr>
+            <w:r>
+              <w:rPr>
+                <w:rFonts w:ascii="Times New Roman" w:cs="Times New Roman" w:eastAsia="Times New Roman" w:hAnsi="Times New Roman"/>
+                <w:sz w:val="20"/>
+                <w:szCs w:val="20"/>
+              </w:rPr>
+              <w:t xml:space="preserve">Sprint 2</w:t>
+            </w:r>
+          </w:p>
+        </w:tc>
+        <w:tc>
+          <w:tcPr>
+            <w:tcBorders>
+              <w:top w:val="single" w:color="BFBFBF" w:sz="4"/>
+              <w:left w:val="single" w:color="BFBFBF" w:sz="4"/>
+              <w:bottom w:val="single" w:color="BFBFBF" w:sz="4"/>
+              <w:right w:val="single" w:color="BFBFBF" w:sz="4"/>
+            </w:tcBorders>
+            <w:shd w:fill="F2F2F2" w:color="auto" w:val="clear"/>
+            <w:tcMar>
+              <w:top w:type="dxa" w:w="40"/>
+              <w:left w:type="dxa" w:w="80"/>
+              <w:bottom w:type="dxa" w:w="40"/>
+              <w:right w:type="dxa" w:w="80"/>
+            </w:tcMar>
+          </w:tcPr>
+          <w:p>
+            <w:pPr>
+              <w:spacing w:after="0" w:line="250"/>
+              <w:jc w:val="center"/>
+            </w:pPr>
+            <w:r>
+              <w:rPr>
+                <w:rFonts w:ascii="Times New Roman" w:cs="Times New Roman" w:eastAsia="Times New Roman" w:hAnsi="Times New Roman"/>
+                <w:sz w:val="20"/>
+                <w:szCs w:val="20"/>
+              </w:rPr>
+              <w:t xml:space="preserve">PB-5</w:t>
+            </w:r>
+          </w:p>
+        </w:tc>
+        <w:tc>
+          <w:tcPr>
+            <w:tcBorders>
+              <w:top w:val="single" w:color="BFBFBF" w:sz="4"/>
+              <w:left w:val="single" w:color="BFBFBF" w:sz="4"/>
+              <w:bottom w:val="single" w:color="BFBFBF" w:sz="4"/>
+              <w:right w:val="single" w:color="BFBFBF" w:sz="4"/>
+            </w:tcBorders>
+            <w:shd w:fill="F2F2F2" w:color="auto" w:val="clear"/>
+            <w:tcMar>
+              <w:top w:type="dxa" w:w="40"/>
+              <w:left w:type="dxa" w:w="80"/>
+              <w:bottom w:type="dxa" w:w="40"/>
+              <w:right w:type="dxa" w:w="80"/>
+            </w:tcMar>
+          </w:tcPr>
+          <w:p>
+            <w:pPr>
+              <w:spacing w:after="0" w:line="250"/>
               <w:jc w:val="left"/>
             </w:pPr>
             <w:r>
@@ -8516,6 +9645,37 @@
                 <w:szCs w:val="20"/>
               </w:rPr>
               <w:t xml:space="preserve">Bán hàng (POS)</w:t>
+            </w:r>
+          </w:p>
+        </w:tc>
+        <w:tc>
+          <w:tcPr>
+            <w:tcBorders>
+              <w:top w:val="single" w:color="BFBFBF" w:sz="4"/>
+              <w:left w:val="single" w:color="BFBFBF" w:sz="4"/>
+              <w:bottom w:val="single" w:color="BFBFBF" w:sz="4"/>
+              <w:right w:val="single" w:color="BFBFBF" w:sz="4"/>
+            </w:tcBorders>
+            <w:shd w:fill="F2F2F2" w:color="auto" w:val="clear"/>
+            <w:tcMar>
+              <w:top w:type="dxa" w:w="40"/>
+              <w:left w:type="dxa" w:w="80"/>
+              <w:bottom w:type="dxa" w:w="40"/>
+              <w:right w:type="dxa" w:w="80"/>
+            </w:tcMar>
+          </w:tcPr>
+          <w:p>
+            <w:pPr>
+              <w:spacing w:after="0" w:line="250"/>
+              <w:jc w:val="center"/>
+            </w:pPr>
+            <w:r>
+              <w:rPr>
+                <w:rFonts w:ascii="Times New Roman" w:cs="Times New Roman" w:eastAsia="Times New Roman" w:hAnsi="Times New Roman"/>
+                <w:sz w:val="20"/>
+                <w:szCs w:val="20"/>
+              </w:rPr>
+              <w:t xml:space="preserve">POS_01→POS_20</w:t>
             </w:r>
           </w:p>
         </w:tc>
@@ -8618,37 +9778,6 @@
             </w:r>
           </w:p>
         </w:tc>
-        <w:tc>
-          <w:tcPr>
-            <w:tcBorders>
-              <w:top w:val="single" w:color="BFBFBF" w:sz="4"/>
-              <w:left w:val="single" w:color="BFBFBF" w:sz="4"/>
-              <w:bottom w:val="single" w:color="BFBFBF" w:sz="4"/>
-              <w:right w:val="single" w:color="BFBFBF" w:sz="4"/>
-            </w:tcBorders>
-            <w:shd w:fill="F2F2F2" w:color="auto" w:val="clear"/>
-            <w:tcMar>
-              <w:top w:type="dxa" w:w="40"/>
-              <w:left w:type="dxa" w:w="80"/>
-              <w:bottom w:type="dxa" w:w="40"/>
-              <w:right w:type="dxa" w:w="80"/>
-            </w:tcMar>
-          </w:tcPr>
-          <w:p>
-            <w:pPr>
-              <w:spacing w:after="0" w:line="250"/>
-              <w:jc w:val="center"/>
-            </w:pPr>
-            <w:r>
-              <w:rPr>
-                <w:rFonts w:ascii="Times New Roman" w:cs="Times New Roman" w:eastAsia="Times New Roman" w:hAnsi="Times New Roman"/>
-                <w:sz w:val="20"/>
-                <w:szCs w:val="20"/>
-              </w:rPr>
-              <w:t xml:space="preserve">90%</w:t>
-            </w:r>
-          </w:p>
-        </w:tc>
       </w:tr>
       <w:tr>
         <w:tc>
@@ -8669,6 +9798,66 @@
           <w:p>
             <w:pPr>
               <w:spacing w:after="0" w:line="250"/>
+              <w:jc w:val="center"/>
+            </w:pPr>
+            <w:r>
+              <w:rPr>
+                <w:rFonts w:ascii="Times New Roman" w:cs="Times New Roman" w:eastAsia="Times New Roman" w:hAnsi="Times New Roman"/>
+                <w:sz w:val="20"/>
+                <w:szCs w:val="20"/>
+              </w:rPr>
+              <w:t xml:space="preserve">Sprint 2</w:t>
+            </w:r>
+          </w:p>
+        </w:tc>
+        <w:tc>
+          <w:tcPr>
+            <w:tcBorders>
+              <w:top w:val="single" w:color="BFBFBF" w:sz="4"/>
+              <w:left w:val="single" w:color="BFBFBF" w:sz="4"/>
+              <w:bottom w:val="single" w:color="BFBFBF" w:sz="4"/>
+              <w:right w:val="single" w:color="BFBFBF" w:sz="4"/>
+            </w:tcBorders>
+            <w:tcMar>
+              <w:top w:type="dxa" w:w="40"/>
+              <w:left w:type="dxa" w:w="80"/>
+              <w:bottom w:type="dxa" w:w="40"/>
+              <w:right w:type="dxa" w:w="80"/>
+            </w:tcMar>
+          </w:tcPr>
+          <w:p>
+            <w:pPr>
+              <w:spacing w:after="0" w:line="250"/>
+              <w:jc w:val="center"/>
+            </w:pPr>
+            <w:r>
+              <w:rPr>
+                <w:rFonts w:ascii="Times New Roman" w:cs="Times New Roman" w:eastAsia="Times New Roman" w:hAnsi="Times New Roman"/>
+                <w:sz w:val="20"/>
+                <w:szCs w:val="20"/>
+              </w:rPr>
+              <w:t xml:space="preserve">PB-5</w:t>
+            </w:r>
+          </w:p>
+        </w:tc>
+        <w:tc>
+          <w:tcPr>
+            <w:tcBorders>
+              <w:top w:val="single" w:color="BFBFBF" w:sz="4"/>
+              <w:left w:val="single" w:color="BFBFBF" w:sz="4"/>
+              <w:bottom w:val="single" w:color="BFBFBF" w:sz="4"/>
+              <w:right w:val="single" w:color="BFBFBF" w:sz="4"/>
+            </w:tcBorders>
+            <w:tcMar>
+              <w:top w:type="dxa" w:w="40"/>
+              <w:left w:type="dxa" w:w="80"/>
+              <w:bottom w:type="dxa" w:w="40"/>
+              <w:right w:type="dxa" w:w="80"/>
+            </w:tcMar>
+          </w:tcPr>
+          <w:p>
+            <w:pPr>
+              <w:spacing w:after="0" w:line="250"/>
               <w:jc w:val="left"/>
             </w:pPr>
             <w:r>
@@ -8708,6 +9897,36 @@
                 <w:szCs w:val="20"/>
               </w:rPr>
               <w:t xml:space="preserve">Quản lý giao hàng</w:t>
+            </w:r>
+          </w:p>
+        </w:tc>
+        <w:tc>
+          <w:tcPr>
+            <w:tcBorders>
+              <w:top w:val="single" w:color="BFBFBF" w:sz="4"/>
+              <w:left w:val="single" w:color="BFBFBF" w:sz="4"/>
+              <w:bottom w:val="single" w:color="BFBFBF" w:sz="4"/>
+              <w:right w:val="single" w:color="BFBFBF" w:sz="4"/>
+            </w:tcBorders>
+            <w:tcMar>
+              <w:top w:type="dxa" w:w="40"/>
+              <w:left w:type="dxa" w:w="80"/>
+              <w:bottom w:type="dxa" w:w="40"/>
+              <w:right w:type="dxa" w:w="80"/>
+            </w:tcMar>
+          </w:tcPr>
+          <w:p>
+            <w:pPr>
+              <w:spacing w:after="0" w:line="250"/>
+              <w:jc w:val="center"/>
+            </w:pPr>
+            <w:r>
+              <w:rPr>
+                <w:rFonts w:ascii="Times New Roman" w:cs="Times New Roman" w:eastAsia="Times New Roman" w:hAnsi="Times New Roman"/>
+                <w:sz w:val="20"/>
+                <w:szCs w:val="20"/>
+              </w:rPr>
+              <w:t xml:space="preserve">GH_01→GH_06</w:t>
             </w:r>
           </w:p>
         </w:tc>
@@ -8807,36 +10026,6 @@
             </w:r>
           </w:p>
         </w:tc>
-        <w:tc>
-          <w:tcPr>
-            <w:tcBorders>
-              <w:top w:val="single" w:color="BFBFBF" w:sz="4"/>
-              <w:left w:val="single" w:color="BFBFBF" w:sz="4"/>
-              <w:bottom w:val="single" w:color="BFBFBF" w:sz="4"/>
-              <w:right w:val="single" w:color="BFBFBF" w:sz="4"/>
-            </w:tcBorders>
-            <w:tcMar>
-              <w:top w:type="dxa" w:w="40"/>
-              <w:left w:type="dxa" w:w="80"/>
-              <w:bottom w:type="dxa" w:w="40"/>
-              <w:right w:type="dxa" w:w="80"/>
-            </w:tcMar>
-          </w:tcPr>
-          <w:p>
-            <w:pPr>
-              <w:spacing w:after="0" w:line="250"/>
-              <w:jc w:val="center"/>
-            </w:pPr>
-            <w:r>
-              <w:rPr>
-                <w:rFonts w:ascii="Times New Roman" w:cs="Times New Roman" w:eastAsia="Times New Roman" w:hAnsi="Times New Roman"/>
-                <w:sz w:val="20"/>
-                <w:szCs w:val="20"/>
-              </w:rPr>
-              <w:t xml:space="preserve">100%</w:t>
-            </w:r>
-          </w:p>
-        </w:tc>
       </w:tr>
       <w:tr>
         <w:tc>
@@ -8858,6 +10047,68 @@
           <w:p>
             <w:pPr>
               <w:spacing w:after="0" w:line="250"/>
+              <w:jc w:val="center"/>
+            </w:pPr>
+            <w:r>
+              <w:rPr>
+                <w:rFonts w:ascii="Times New Roman" w:cs="Times New Roman" w:eastAsia="Times New Roman" w:hAnsi="Times New Roman"/>
+                <w:sz w:val="20"/>
+                <w:szCs w:val="20"/>
+              </w:rPr>
+              <w:t xml:space="preserve">Sprint 2</w:t>
+            </w:r>
+          </w:p>
+        </w:tc>
+        <w:tc>
+          <w:tcPr>
+            <w:tcBorders>
+              <w:top w:val="single" w:color="BFBFBF" w:sz="4"/>
+              <w:left w:val="single" w:color="BFBFBF" w:sz="4"/>
+              <w:bottom w:val="single" w:color="BFBFBF" w:sz="4"/>
+              <w:right w:val="single" w:color="BFBFBF" w:sz="4"/>
+            </w:tcBorders>
+            <w:shd w:fill="F2F2F2" w:color="auto" w:val="clear"/>
+            <w:tcMar>
+              <w:top w:type="dxa" w:w="40"/>
+              <w:left w:type="dxa" w:w="80"/>
+              <w:bottom w:type="dxa" w:w="40"/>
+              <w:right w:type="dxa" w:w="80"/>
+            </w:tcMar>
+          </w:tcPr>
+          <w:p>
+            <w:pPr>
+              <w:spacing w:after="0" w:line="250"/>
+              <w:jc w:val="center"/>
+            </w:pPr>
+            <w:r>
+              <w:rPr>
+                <w:rFonts w:ascii="Times New Roman" w:cs="Times New Roman" w:eastAsia="Times New Roman" w:hAnsi="Times New Roman"/>
+                <w:sz w:val="20"/>
+                <w:szCs w:val="20"/>
+              </w:rPr>
+              <w:t xml:space="preserve">PB-6</w:t>
+            </w:r>
+          </w:p>
+        </w:tc>
+        <w:tc>
+          <w:tcPr>
+            <w:tcBorders>
+              <w:top w:val="single" w:color="BFBFBF" w:sz="4"/>
+              <w:left w:val="single" w:color="BFBFBF" w:sz="4"/>
+              <w:bottom w:val="single" w:color="BFBFBF" w:sz="4"/>
+              <w:right w:val="single" w:color="BFBFBF" w:sz="4"/>
+            </w:tcBorders>
+            <w:shd w:fill="F2F2F2" w:color="auto" w:val="clear"/>
+            <w:tcMar>
+              <w:top w:type="dxa" w:w="40"/>
+              <w:left w:type="dxa" w:w="80"/>
+              <w:bottom w:type="dxa" w:w="40"/>
+              <w:right w:type="dxa" w:w="80"/>
+            </w:tcMar>
+          </w:tcPr>
+          <w:p>
+            <w:pPr>
+              <w:spacing w:after="0" w:line="250"/>
               <w:jc w:val="left"/>
             </w:pPr>
             <w:r>
@@ -8898,6 +10149,37 @@
                 <w:szCs w:val="20"/>
               </w:rPr>
               <w:t xml:space="preserve">Quản lý phiếu giảm giá</w:t>
+            </w:r>
+          </w:p>
+        </w:tc>
+        <w:tc>
+          <w:tcPr>
+            <w:tcBorders>
+              <w:top w:val="single" w:color="BFBFBF" w:sz="4"/>
+              <w:left w:val="single" w:color="BFBFBF" w:sz="4"/>
+              <w:bottom w:val="single" w:color="BFBFBF" w:sz="4"/>
+              <w:right w:val="single" w:color="BFBFBF" w:sz="4"/>
+            </w:tcBorders>
+            <w:shd w:fill="F2F2F2" w:color="auto" w:val="clear"/>
+            <w:tcMar>
+              <w:top w:type="dxa" w:w="40"/>
+              <w:left w:type="dxa" w:w="80"/>
+              <w:bottom w:type="dxa" w:w="40"/>
+              <w:right w:type="dxa" w:w="80"/>
+            </w:tcMar>
+          </w:tcPr>
+          <w:p>
+            <w:pPr>
+              <w:spacing w:after="0" w:line="250"/>
+              <w:jc w:val="center"/>
+            </w:pPr>
+            <w:r>
+              <w:rPr>
+                <w:rFonts w:ascii="Times New Roman" w:cs="Times New Roman" w:eastAsia="Times New Roman" w:hAnsi="Times New Roman"/>
+                <w:sz w:val="20"/>
+                <w:szCs w:val="20"/>
+              </w:rPr>
+              <w:t xml:space="preserve">PGG_01→PGG_10</w:t>
             </w:r>
           </w:p>
         </w:tc>
@@ -9000,37 +10282,6 @@
             </w:r>
           </w:p>
         </w:tc>
-        <w:tc>
-          <w:tcPr>
-            <w:tcBorders>
-              <w:top w:val="single" w:color="BFBFBF" w:sz="4"/>
-              <w:left w:val="single" w:color="BFBFBF" w:sz="4"/>
-              <w:bottom w:val="single" w:color="BFBFBF" w:sz="4"/>
-              <w:right w:val="single" w:color="BFBFBF" w:sz="4"/>
-            </w:tcBorders>
-            <w:shd w:fill="F2F2F2" w:color="auto" w:val="clear"/>
-            <w:tcMar>
-              <w:top w:type="dxa" w:w="40"/>
-              <w:left w:type="dxa" w:w="80"/>
-              <w:bottom w:type="dxa" w:w="40"/>
-              <w:right w:type="dxa" w:w="80"/>
-            </w:tcMar>
-          </w:tcPr>
-          <w:p>
-            <w:pPr>
-              <w:spacing w:after="0" w:line="250"/>
-              <w:jc w:val="center"/>
-            </w:pPr>
-            <w:r>
-              <w:rPr>
-                <w:rFonts w:ascii="Times New Roman" w:cs="Times New Roman" w:eastAsia="Times New Roman" w:hAnsi="Times New Roman"/>
-                <w:sz w:val="20"/>
-                <w:szCs w:val="20"/>
-              </w:rPr>
-              <w:t xml:space="preserve">90%</w:t>
-            </w:r>
-          </w:p>
-        </w:tc>
       </w:tr>
       <w:tr>
         <w:tc>
@@ -9051,6 +10302,66 @@
           <w:p>
             <w:pPr>
               <w:spacing w:after="0" w:line="250"/>
+              <w:jc w:val="center"/>
+            </w:pPr>
+            <w:r>
+              <w:rPr>
+                <w:rFonts w:ascii="Times New Roman" w:cs="Times New Roman" w:eastAsia="Times New Roman" w:hAnsi="Times New Roman"/>
+                <w:sz w:val="20"/>
+                <w:szCs w:val="20"/>
+              </w:rPr>
+              <w:t xml:space="preserve">Sprint 3</w:t>
+            </w:r>
+          </w:p>
+        </w:tc>
+        <w:tc>
+          <w:tcPr>
+            <w:tcBorders>
+              <w:top w:val="single" w:color="BFBFBF" w:sz="4"/>
+              <w:left w:val="single" w:color="BFBFBF" w:sz="4"/>
+              <w:bottom w:val="single" w:color="BFBFBF" w:sz="4"/>
+              <w:right w:val="single" w:color="BFBFBF" w:sz="4"/>
+            </w:tcBorders>
+            <w:tcMar>
+              <w:top w:type="dxa" w:w="40"/>
+              <w:left w:type="dxa" w:w="80"/>
+              <w:bottom w:type="dxa" w:w="40"/>
+              <w:right w:type="dxa" w:w="80"/>
+            </w:tcMar>
+          </w:tcPr>
+          <w:p>
+            <w:pPr>
+              <w:spacing w:after="0" w:line="250"/>
+              <w:jc w:val="center"/>
+            </w:pPr>
+            <w:r>
+              <w:rPr>
+                <w:rFonts w:ascii="Times New Roman" w:cs="Times New Roman" w:eastAsia="Times New Roman" w:hAnsi="Times New Roman"/>
+                <w:sz w:val="20"/>
+                <w:szCs w:val="20"/>
+              </w:rPr>
+              <w:t xml:space="preserve">PB-7</w:t>
+            </w:r>
+          </w:p>
+        </w:tc>
+        <w:tc>
+          <w:tcPr>
+            <w:tcBorders>
+              <w:top w:val="single" w:color="BFBFBF" w:sz="4"/>
+              <w:left w:val="single" w:color="BFBFBF" w:sz="4"/>
+              <w:bottom w:val="single" w:color="BFBFBF" w:sz="4"/>
+              <w:right w:val="single" w:color="BFBFBF" w:sz="4"/>
+            </w:tcBorders>
+            <w:tcMar>
+              <w:top w:type="dxa" w:w="40"/>
+              <w:left w:type="dxa" w:w="80"/>
+              <w:bottom w:type="dxa" w:w="40"/>
+              <w:right w:type="dxa" w:w="80"/>
+            </w:tcMar>
+          </w:tcPr>
+          <w:p>
+            <w:pPr>
+              <w:spacing w:after="0" w:line="250"/>
               <w:jc w:val="left"/>
             </w:pPr>
             <w:r>
@@ -9090,6 +10401,36 @@
                 <w:szCs w:val="20"/>
               </w:rPr>
               <w:t xml:space="preserve">Quản lý trả hàng</w:t>
+            </w:r>
+          </w:p>
+        </w:tc>
+        <w:tc>
+          <w:tcPr>
+            <w:tcBorders>
+              <w:top w:val="single" w:color="BFBFBF" w:sz="4"/>
+              <w:left w:val="single" w:color="BFBFBF" w:sz="4"/>
+              <w:bottom w:val="single" w:color="BFBFBF" w:sz="4"/>
+              <w:right w:val="single" w:color="BFBFBF" w:sz="4"/>
+            </w:tcBorders>
+            <w:tcMar>
+              <w:top w:type="dxa" w:w="40"/>
+              <w:left w:type="dxa" w:w="80"/>
+              <w:bottom w:type="dxa" w:w="40"/>
+              <w:right w:type="dxa" w:w="80"/>
+            </w:tcMar>
+          </w:tcPr>
+          <w:p>
+            <w:pPr>
+              <w:spacing w:after="0" w:line="250"/>
+              <w:jc w:val="center"/>
+            </w:pPr>
+            <w:r>
+              <w:rPr>
+                <w:rFonts w:ascii="Times New Roman" w:cs="Times New Roman" w:eastAsia="Times New Roman" w:hAnsi="Times New Roman"/>
+                <w:sz w:val="20"/>
+                <w:szCs w:val="20"/>
+              </w:rPr>
+              <w:t xml:space="preserve">TH_01→TH_07</w:t>
             </w:r>
           </w:p>
         </w:tc>
@@ -9189,36 +10530,6 @@
             </w:r>
           </w:p>
         </w:tc>
-        <w:tc>
-          <w:tcPr>
-            <w:tcBorders>
-              <w:top w:val="single" w:color="BFBFBF" w:sz="4"/>
-              <w:left w:val="single" w:color="BFBFBF" w:sz="4"/>
-              <w:bottom w:val="single" w:color="BFBFBF" w:sz="4"/>
-              <w:right w:val="single" w:color="BFBFBF" w:sz="4"/>
-            </w:tcBorders>
-            <w:tcMar>
-              <w:top w:type="dxa" w:w="40"/>
-              <w:left w:type="dxa" w:w="80"/>
-              <w:bottom w:type="dxa" w:w="40"/>
-              <w:right w:type="dxa" w:w="80"/>
-            </w:tcMar>
-          </w:tcPr>
-          <w:p>
-            <w:pPr>
-              <w:spacing w:after="0" w:line="250"/>
-              <w:jc w:val="center"/>
-            </w:pPr>
-            <w:r>
-              <w:rPr>
-                <w:rFonts w:ascii="Times New Roman" w:cs="Times New Roman" w:eastAsia="Times New Roman" w:hAnsi="Times New Roman"/>
-                <w:sz w:val="20"/>
-                <w:szCs w:val="20"/>
-              </w:rPr>
-              <w:t xml:space="preserve">86%</w:t>
-            </w:r>
-          </w:p>
-        </w:tc>
       </w:tr>
       <w:tr>
         <w:tc>
@@ -9240,6 +10551,68 @@
           <w:p>
             <w:pPr>
               <w:spacing w:after="0" w:line="250"/>
+              <w:jc w:val="center"/>
+            </w:pPr>
+            <w:r>
+              <w:rPr>
+                <w:rFonts w:ascii="Times New Roman" w:cs="Times New Roman" w:eastAsia="Times New Roman" w:hAnsi="Times New Roman"/>
+                <w:sz w:val="20"/>
+                <w:szCs w:val="20"/>
+              </w:rPr>
+              <w:t xml:space="preserve">Sprint 3</w:t>
+            </w:r>
+          </w:p>
+        </w:tc>
+        <w:tc>
+          <w:tcPr>
+            <w:tcBorders>
+              <w:top w:val="single" w:color="BFBFBF" w:sz="4"/>
+              <w:left w:val="single" w:color="BFBFBF" w:sz="4"/>
+              <w:bottom w:val="single" w:color="BFBFBF" w:sz="4"/>
+              <w:right w:val="single" w:color="BFBFBF" w:sz="4"/>
+            </w:tcBorders>
+            <w:shd w:fill="F2F2F2" w:color="auto" w:val="clear"/>
+            <w:tcMar>
+              <w:top w:type="dxa" w:w="40"/>
+              <w:left w:type="dxa" w:w="80"/>
+              <w:bottom w:type="dxa" w:w="40"/>
+              <w:right w:type="dxa" w:w="80"/>
+            </w:tcMar>
+          </w:tcPr>
+          <w:p>
+            <w:pPr>
+              <w:spacing w:after="0" w:line="250"/>
+              <w:jc w:val="center"/>
+            </w:pPr>
+            <w:r>
+              <w:rPr>
+                <w:rFonts w:ascii="Times New Roman" w:cs="Times New Roman" w:eastAsia="Times New Roman" w:hAnsi="Times New Roman"/>
+                <w:sz w:val="20"/>
+                <w:szCs w:val="20"/>
+              </w:rPr>
+              <w:t xml:space="preserve">PB-8</w:t>
+            </w:r>
+          </w:p>
+        </w:tc>
+        <w:tc>
+          <w:tcPr>
+            <w:tcBorders>
+              <w:top w:val="single" w:color="BFBFBF" w:sz="4"/>
+              <w:left w:val="single" w:color="BFBFBF" w:sz="4"/>
+              <w:bottom w:val="single" w:color="BFBFBF" w:sz="4"/>
+              <w:right w:val="single" w:color="BFBFBF" w:sz="4"/>
+            </w:tcBorders>
+            <w:shd w:fill="F2F2F2" w:color="auto" w:val="clear"/>
+            <w:tcMar>
+              <w:top w:type="dxa" w:w="40"/>
+              <w:left w:type="dxa" w:w="80"/>
+              <w:bottom w:type="dxa" w:w="40"/>
+              <w:right w:type="dxa" w:w="80"/>
+            </w:tcMar>
+          </w:tcPr>
+          <w:p>
+            <w:pPr>
+              <w:spacing w:after="0" w:line="250"/>
               <w:jc w:val="left"/>
             </w:pPr>
             <w:r>
@@ -9280,6 +10653,37 @@
                 <w:szCs w:val="20"/>
               </w:rPr>
               <w:t xml:space="preserve">Quản lý khách hàng</w:t>
+            </w:r>
+          </w:p>
+        </w:tc>
+        <w:tc>
+          <w:tcPr>
+            <w:tcBorders>
+              <w:top w:val="single" w:color="BFBFBF" w:sz="4"/>
+              <w:left w:val="single" w:color="BFBFBF" w:sz="4"/>
+              <w:bottom w:val="single" w:color="BFBFBF" w:sz="4"/>
+              <w:right w:val="single" w:color="BFBFBF" w:sz="4"/>
+            </w:tcBorders>
+            <w:shd w:fill="F2F2F2" w:color="auto" w:val="clear"/>
+            <w:tcMar>
+              <w:top w:type="dxa" w:w="40"/>
+              <w:left w:type="dxa" w:w="80"/>
+              <w:bottom w:type="dxa" w:w="40"/>
+              <w:right w:type="dxa" w:w="80"/>
+            </w:tcMar>
+          </w:tcPr>
+          <w:p>
+            <w:pPr>
+              <w:spacing w:after="0" w:line="250"/>
+              <w:jc w:val="center"/>
+            </w:pPr>
+            <w:r>
+              <w:rPr>
+                <w:rFonts w:ascii="Times New Roman" w:cs="Times New Roman" w:eastAsia="Times New Roman" w:hAnsi="Times New Roman"/>
+                <w:sz w:val="20"/>
+                <w:szCs w:val="20"/>
+              </w:rPr>
+              <w:t xml:space="preserve">KH_01→KH_12</w:t>
             </w:r>
           </w:p>
         </w:tc>
@@ -9382,37 +10786,6 @@
             </w:r>
           </w:p>
         </w:tc>
-        <w:tc>
-          <w:tcPr>
-            <w:tcBorders>
-              <w:top w:val="single" w:color="BFBFBF" w:sz="4"/>
-              <w:left w:val="single" w:color="BFBFBF" w:sz="4"/>
-              <w:bottom w:val="single" w:color="BFBFBF" w:sz="4"/>
-              <w:right w:val="single" w:color="BFBFBF" w:sz="4"/>
-            </w:tcBorders>
-            <w:shd w:fill="F2F2F2" w:color="auto" w:val="clear"/>
-            <w:tcMar>
-              <w:top w:type="dxa" w:w="40"/>
-              <w:left w:type="dxa" w:w="80"/>
-              <w:bottom w:type="dxa" w:w="40"/>
-              <w:right w:type="dxa" w:w="80"/>
-            </w:tcMar>
-          </w:tcPr>
-          <w:p>
-            <w:pPr>
-              <w:spacing w:after="0" w:line="250"/>
-              <w:jc w:val="center"/>
-            </w:pPr>
-            <w:r>
-              <w:rPr>
-                <w:rFonts w:ascii="Times New Roman" w:cs="Times New Roman" w:eastAsia="Times New Roman" w:hAnsi="Times New Roman"/>
-                <w:sz w:val="20"/>
-                <w:szCs w:val="20"/>
-              </w:rPr>
-              <w:t xml:space="preserve">100%</w:t>
-            </w:r>
-          </w:p>
-        </w:tc>
       </w:tr>
       <w:tr>
         <w:tc>
@@ -9434,7 +10807,7 @@
           <w:p>
             <w:pPr>
               <w:spacing w:after="0" w:line="250"/>
-              <w:jc w:val="left"/>
+              <w:jc w:val="center"/>
             </w:pPr>
             <w:r>
               <w:rPr>
@@ -9444,7 +10817,7 @@
                 <w:sz w:val="20"/>
                 <w:szCs w:val="20"/>
               </w:rPr>
-              <w:t xml:space="preserve">TỔNG (RQ-1→RQ-24)</w:t>
+              <w:t xml:space="preserve">S1-S3</w:t>
             </w:r>
           </w:p>
         </w:tc>
@@ -9467,7 +10840,7 @@
           <w:p>
             <w:pPr>
               <w:spacing w:after="0" w:line="250"/>
-              <w:jc w:val="left"/>
+              <w:jc w:val="center"/>
             </w:pPr>
             <w:r>
               <w:rPr>
@@ -9477,7 +10850,7 @@
                 <w:sz w:val="20"/>
                 <w:szCs w:val="20"/>
               </w:rPr>
-              <w:t xml:space="preserve">10 module</w:t>
+              <w:t xml:space="preserve">pb-1→PB-8</w:t>
             </w:r>
           </w:p>
         </w:tc>
@@ -9500,7 +10873,7 @@
           <w:p>
             <w:pPr>
               <w:spacing w:after="0" w:line="250"/>
-              <w:jc w:val="center"/>
+              <w:jc w:val="left"/>
             </w:pPr>
             <w:r>
               <w:rPr>
@@ -9510,7 +10883,7 @@
                 <w:sz w:val="20"/>
                 <w:szCs w:val="20"/>
               </w:rPr>
-              <w:t xml:space="preserve">114</w:t>
+              <w:t xml:space="preserve">RQ-1→RQ-24</w:t>
             </w:r>
           </w:p>
         </w:tc>
@@ -9533,7 +10906,7 @@
           <w:p>
             <w:pPr>
               <w:spacing w:after="0" w:line="250"/>
-              <w:jc w:val="center"/>
+              <w:jc w:val="left"/>
             </w:pPr>
             <w:r>
               <w:rPr>
@@ -9543,7 +10916,7 @@
                 <w:sz w:val="20"/>
                 <w:szCs w:val="20"/>
               </w:rPr>
-              <w:t xml:space="preserve">106</w:t>
+              <w:t xml:space="preserve">10 module</w:t>
             </w:r>
           </w:p>
         </w:tc>
@@ -9576,7 +10949,7 @@
                 <w:sz w:val="20"/>
                 <w:szCs w:val="20"/>
               </w:rPr>
-              <w:t xml:space="preserve">8</w:t>
+              <w:t xml:space="preserve">114 TC</w:t>
             </w:r>
           </w:p>
         </w:tc>
@@ -9609,7 +10982,73 @@
                 <w:sz w:val="20"/>
                 <w:szCs w:val="20"/>
               </w:rPr>
-              <w:t xml:space="preserve">93%</w:t>
+              <w:t xml:space="preserve">114</w:t>
+            </w:r>
+          </w:p>
+        </w:tc>
+        <w:tc>
+          <w:tcPr>
+            <w:tcBorders>
+              <w:top w:val="single" w:color="BFBFBF" w:sz="4"/>
+              <w:left w:val="single" w:color="BFBFBF" w:sz="4"/>
+              <w:bottom w:val="single" w:color="BFBFBF" w:sz="4"/>
+              <w:right w:val="single" w:color="BFBFBF" w:sz="4"/>
+            </w:tcBorders>
+            <w:shd w:fill="DDEBF7" w:color="auto" w:val="clear"/>
+            <w:tcMar>
+              <w:top w:type="dxa" w:w="40"/>
+              <w:left w:type="dxa" w:w="80"/>
+              <w:bottom w:type="dxa" w:w="40"/>
+              <w:right w:type="dxa" w:w="80"/>
+            </w:tcMar>
+          </w:tcPr>
+          <w:p>
+            <w:pPr>
+              <w:spacing w:after="0" w:line="250"/>
+              <w:jc w:val="center"/>
+            </w:pPr>
+            <w:r>
+              <w:rPr>
+                <w:rFonts w:ascii="Times New Roman" w:cs="Times New Roman" w:eastAsia="Times New Roman" w:hAnsi="Times New Roman"/>
+                <w:b/>
+                <w:bCs/>
+                <w:sz w:val="20"/>
+                <w:szCs w:val="20"/>
+              </w:rPr>
+              <w:t xml:space="preserve">106</w:t>
+            </w:r>
+          </w:p>
+        </w:tc>
+        <w:tc>
+          <w:tcPr>
+            <w:tcBorders>
+              <w:top w:val="single" w:color="BFBFBF" w:sz="4"/>
+              <w:left w:val="single" w:color="BFBFBF" w:sz="4"/>
+              <w:bottom w:val="single" w:color="BFBFBF" w:sz="4"/>
+              <w:right w:val="single" w:color="BFBFBF" w:sz="4"/>
+            </w:tcBorders>
+            <w:shd w:fill="DDEBF7" w:color="auto" w:val="clear"/>
+            <w:tcMar>
+              <w:top w:type="dxa" w:w="40"/>
+              <w:left w:type="dxa" w:w="80"/>
+              <w:bottom w:type="dxa" w:w="40"/>
+              <w:right w:type="dxa" w:w="80"/>
+            </w:tcMar>
+          </w:tcPr>
+          <w:p>
+            <w:pPr>
+              <w:spacing w:after="0" w:line="250"/>
+              <w:jc w:val="center"/>
+            </w:pPr>
+            <w:r>
+              <w:rPr>
+                <w:rFonts w:ascii="Times New Roman" w:cs="Times New Roman" w:eastAsia="Times New Roman" w:hAnsi="Times New Roman"/>
+                <w:b/>
+                <w:bCs/>
+                <w:sz w:val="20"/>
+                <w:szCs w:val="20"/>
+              </w:rPr>
+              <w:t xml:space="preserve">8</w:t>
             </w:r>
           </w:p>
         </w:tc>

</xml_diff>